<commit_message>
Remove fabricated "EXAONE reasoning mode: minimal-pair probe" claim
Found during further audit: the paper (Section III-C, IV-D, Fig. 3) and
make_figures.py claimed escalation switches EXAONE into reasoning mode to
generate a "minimal-pair probe." Checked exaone_provider.py directly --
it calls enable_thinking=False unconditionally, everywhere, with no
escalation branch at all; answer_processing.py's escalation path only
calls qwen_feedback's detailed_feedback/fast_feedback (Qwen3), never
touches EXAONE. This wasn't a weak-evidence issue like Novelty 2's width
claim -- the mechanism described was never built at all. Removed the
claim rather than reframe it: escalation is now described accurately as
switching only Qwen3 between its reasoning and non-reasoning modes;
EXAONE's role (generation only, non-reasoning mode throughout) is stated
plainly in Section III-C. Regenerated fig3_escalation.png to match.

Co-Authored-By: Claude Sonnet 5 <noreply@anthropic.com>
</commit_message>
<xml_diff>
--- a/paper/KO-DRILL_IEEE.docx
+++ b/paper/KO-DRILL_IEEE.docx
@@ -1259,7 +1259,7 @@
           <w:color w:val="000000"/>
           <w:sz w:val="20"/>
         </w:rPr>
-        <w:t>Korean generation: EXAONE. LG AI Research's EXAONE family [34] is trained with Korean as a first-class language rather than as one of many, which matters in two concrete ways. Its tokeniser segments Hangul efficiently, reducing both cost and the morphological fragmentation that inflates sequence length for Korean in English-centric tokenisers—the same consideration that motivates KRongBERT's morphological factorisation [26]. And its hybrid design, offering both a fast non-reasoning mode and a slower reasoning mode, maps unusually well onto the escalation policy we describe in Section IV-D. The main caveat is licensing: EXAONE is released under terms restricting commercial use, which is unproblematic for research but must be disclosed, and which is a reason to retain a permissively licensed fallback.</w:t>
+        <w:t>Korean generation: EXAONE. LG AI Research's EXAONE family [34] is trained with Korean as a first-class language rather than as one of many, which matters in two concrete ways. Its tokeniser segments Hangul efficiently, reducing both cost and the morphological fragmentation that inflates sequence length for Korean in English-centric tokenisers—the same consideration that motivates KRongBERT's morphological factorisation [26]. EXAONE's role in this system is generation only (item stems, verb lemmas), and its non-reasoning mode is sufficient for that narrow task throughout—we do not exercise its reasoning mode anywhere, so we do not claim its hybrid design as a property this system relies on. The escalation policy in Section IV-D switches Qwen3 between its modes, not EXAONE. The main caveat on EXAONE is licensing: it is released under terms restricting commercial use, which is unproblematic for research but must be disclosed, and which is a reason to retain a permissively licensed fallback.</w:t>
       </w:r>
     </w:p>
     <w:p>
@@ -2168,7 +2168,7 @@
           <w:color w:val="000000"/>
           <w:sz w:val="20"/>
         </w:rPr>
-        <w:t xml:space="preserve"> is a natively available signal of how evenly matched the learner's recent record has been against the items they faced, maximal when that record sits near a coin flip. By default the system takes a routine path—fast non-reasoning generation and short, cached feedback—and escalates to reasoning-mode generation of a minimal-pair probe and a contrastive explanation only when the recent record is ambiguous enough, or a misconception has persisted enough, to be worth the cost:</w:t>
+        <w:t xml:space="preserve"> is a natively available signal of how evenly matched the learner's recent record has been against the items they faced, maximal when that record sits near a coin flip. This policy gates Qwen3's feedback generation only—EXAONE's role is item generation, already finished before a learner answers, and does not itself branch on escalation. By default the system takes a routine path: Qwen3's fast non-reasoning mode, short and cached. It escalates to Qwen3's reasoning mode, producing a contrastive explanation that names the specific misconception, only when the recent record is ambiguous enough, or a misconception has persisted enough, to be worth the cost:</w:t>
       </w:r>
     </w:p>
     <w:p>

</xml_diff>

<commit_message>
Trim literature review to 13 sources and renumber citations; add source PDFs
Drops 2 of the 15 sources, renumbers all in-text citation brackets in
src/content.py and docs/literature-review-15.md to match, regenerates
the IEEE paper (docx/pdf) and item discrimination results, and adds the
13 source PDFs to docs/ for reference.

Co-Authored-By: Claude Sonnet 5 <noreply@anthropic.com>
</commit_message>
<xml_diff>
--- a/paper/KO-DRILL_IEEE.docx
+++ b/paper/KO-DRILL_IEEE.docx
@@ -189,7 +189,7 @@
           <w:color w:val="000000"/>
           <w:sz w:val="20"/>
         </w:rPr>
-        <w:t>Learning a language is, to an unglamorous degree, a matter of repetition. Learners need to meet the same grammatical pattern many times, in varied contexts, spaced out over weeks, and they need to be told promptly when they get it wrong. This is the principle behind drill practice, and it is well supported: retrieval practice, in which the learner must produce an answer rather than merely re-read material, produces more durable memory than passive review, and scheduling that practice according to a model of forgetting improves retention further still [28].</w:t>
+        <w:t>Learning a language is, to an unglamorous degree, a matter of repetition. Learners need to meet the same grammatical pattern many times, in varied contexts, spaced out over weeks, and they need to be told promptly when they get it wrong. This is the principle behind drill practice, and it is well supported: retrieval practice, in which the learner must produce an answer rather than merely re-read material, produces more durable memory than passive review, and scheduling that practice according to a model of forgetting improves retention further still [26].</w:t>
       </w:r>
     </w:p>
     <w:p>
@@ -207,7 +207,7 @@
           <w:color w:val="000000"/>
           <w:sz w:val="20"/>
         </w:rPr>
-        <w:t>Korean presents a particularly strong case for drill practice, and a particularly awkward one for existing tools. Korean is an agglutinative language: grammatical information is carried by particles attached to nouns and by endings attached to verbs. A learner must choose correctly among markers that have no direct equivalent in English, decide between the topic marker and the subject marker in contexts where both are grammatical but convey different emphasis, conjugate verbs that follow irregular patterns, and select an appropriate level of politeness for the social relationship being described. Corpus studies of learner writing confirm that these are precisely the areas where errors concentrate and persist [24], [25]. They are also areas that reward exactly the kind of high-volume, finely targeted practice that is tedious for a human teacher to prepare.</w:t>
+        <w:t>Korean presents a particularly strong case for drill practice, and a particularly awkward one for existing tools. Korean is an agglutinative language: grammatical information is carried by particles attached to nouns and by endings attached to verbs. A learner must choose correctly among markers that have no direct equivalent in English, decide between the topic marker and the subject marker in contexts where both are grammatical but convey different emphasis, conjugate verbs that follow irregular patterns, and select an appropriate level of politeness for the social relationship being described. Corpus studies of learner writing confirm that these are precisely the areas where errors concentrate and persist [22], [23]. They are also areas that reward exactly the kind of high-volume, finely targeted practice that is tedious for a human teacher to prepare.</w:t>
       </w:r>
     </w:p>
     <w:p>
@@ -225,7 +225,7 @@
           <w:color w:val="000000"/>
           <w:sz w:val="20"/>
         </w:rPr>
-        <w:t>Until recently the limiting factor was supply. Producing a few thousand well-formed practice items, each targeting one grammatical point at a known level of difficulty, with plausible wrong answers, is weeks of expert labour. Large language models (LLMs) have changed this: systematic reviews now document a large and rapidly maturing literature on automatic question generation, with models producing multiple-choice items at a quality that is beginning to approach human-authored material [5], [6], [7], [8]. The bottleneck has moved.</w:t>
+        <w:t>Until recently the limiting factor was supply. Producing a few thousand well-formed practice items, each targeting one grammatical point at a known level of difficulty, with plausible wrong answers, is weeks of expert labour. Large language models (LLMs) have changed this: systematic reviews now document a large and rapidly maturing literature on automatic question generation, with models producing multiple-choice items at a quality that is beginning to approach human-authored material [2], [3], [4]. The bottleneck has moved.</w:t>
       </w:r>
     </w:p>
     <w:p>
@@ -243,7 +243,7 @@
           <w:color w:val="000000"/>
           <w:sz w:val="20"/>
         </w:rPr>
-        <w:t>Where it has moved to is the subject of this paper. A personalised drill system must answer two questions on every turn: how good is this learner, and how hard is this question? Adaptive testing has mature machinery for both, but that machinery assumes a fixed bank of questions that have been administered to a calibration sample before being used in earnest. A generative system violates this assumption completely. If items are written on demand, every item is, at the moment it is first served, an item about which nothing is known. One might hope the LLM could simply be asked how hard its own question is. The evidence says otherwise: LLM self-estimates of item difficulty are not a reliable substitute for calibration from real responses: simulated-respondent studies find a single LLM reproduces human item parameters only partially—correlated at the item level, but with a narrower ability distribution and less response variability than real learners, improving only when several models are pooled [12]—and small encoders fine-tuned specifically for difficulty regression outperform far larger general-purpose models at the task outright [11]. One might instead reach for deep knowledge tracing, the dominant neural approach to learner modelling [19], [20], [21]. But knowledge tracing learns from many learners answering the same items; with an item pool that is effectively infinite and a long tail of items seen a handful of times, there is nothing for it to learn from. This is the cold-start problem in an unusually severe form, affecting not a minority of items but, in principle, all of them [33].</w:t>
+        <w:t>Where it has moved to is the subject of this paper. A personalised drill system must answer two questions on every turn: how good is this learner, and how hard is this question? Adaptive testing has mature machinery for both, but that machinery assumes a fixed bank of questions that have been administered to a calibration sample before being used in earnest. A generative system violates this assumption completely. If items are written on demand, every item is, at the moment it is first served, an item about which nothing is known. One might hope the LLM could simply be asked how hard its own question is. The evidence says otherwise: LLM self-estimates of item difficulty are not a reliable substitute for calibration from real responses: simulated-respondent studies find a single LLM reproduces human item parameters only partially—correlated at the item level, but with a narrower ability distribution and less response variability than real learners, improving only when several models are pooled [8]—and small encoders fine-tuned specifically for difficulty regression outperform far larger general-purpose models at the task outright [7]. One might instead reach for deep knowledge tracing, the dominant neural approach to learner modelling [17], [18], [19]. But knowledge tracing learns from many learners answering the same items; with an item pool that is effectively infinite and a long tail of items seen a handful of times, there is nothing for it to learn from. This is the cold-start problem in an unusually severe form, affecting not a minority of items but, in principle, all of them [31].</w:t>
       </w:r>
     </w:p>
     <w:p>
@@ -442,7 +442,7 @@
           <w:color w:val="000000"/>
           <w:sz w:val="20"/>
         </w:rPr>
-        <w:t>Automatic item generation—having software write test questions—long predates LLMs, but transformer-based models changed its practical reach. A 2025 systematic review of transformer and LLM approaches to multiple-choice question generation finds consistent improvement over earlier template and rule-based pipelines, while noting that evaluation in the field remains dominated by surface metrics of fluency rather than measures of pedagogical usefulness [5]. A broader 2026 survey reaches a similar conclusion and identifies difficulty control as an open problem [6]. Applied work confirms feasibility across subjects: Ling and Afzaal generate question–answer pairs for higher education from pre-trained models [7], and Badenes-Olmedo and Eyzaguirre's QuerIA system couples generation with evaluation in a university setting [8]. Dong and Li address difficulty control directly, combining active learning for labelling with low-rank adaptation to steer a model towards a requested difficulty level [9].</w:t>
+        <w:t>Automatic item generation—having software write test questions—long predates LLMs, but transformer-based models changed its practical reach. A 2025 systematic review of transformer and LLM approaches to multiple-choice question generation finds consistent improvement over earlier template and rule-based pipelines, while noting that evaluation in the field remains dominated by surface metrics of fluency rather than measures of pedagogical usefulness [2]. A broader 2026 survey reaches a similar conclusion and identifies difficulty control as an open problem [3]. Applied work confirms feasibility: Badenes-Olmedo and Eyzaguirre's QuerIA system couples generation with evaluation in a university setting [4]. Dong and Li address difficulty control directly, combining active learning for labelling with low-rank adaptation to steer a model towards a requested difficulty level [5].</w:t>
       </w:r>
     </w:p>
     <w:p>
@@ -460,7 +460,7 @@
           <w:color w:val="000000"/>
           <w:sz w:val="20"/>
         </w:rPr>
-        <w:t>Distractors—the plausible wrong answers in a multiple-choice item—have received separate attention, because they are harder to produce than the correct answer and matter more than is often appreciated. A wrong answer that nobody would ever choose contributes nothing; a wrong answer that is in fact also correct actively damages the test. Bitew et al. show that predictive prompting improves distractor plausibility over prior approaches [10], but the reported ceiling—roughly half of generated distractors rated high quality by teachers—indicates how much room remains. Crucially, the entire line of work optimises for plausibility. None of it asks the question we think is more useful: what does the choice of a particular wrong answer tell us about the learner? A parallel line of work uses LLMs not to generate educational content but to judge it, as Li et al. do for student-generated material in learnersourcing [14]; this is closer to the verification role we describe in Section IV-B, though it has not been applied to checking the grammatical validity of generated distractors.</w:t>
+        <w:t>Distractors—the plausible wrong answers in a multiple-choice item—have received separate attention, because they are harder to produce than the correct answer and matter more than is often appreciated. A wrong answer that nobody would ever choose contributes nothing; a wrong answer that is in fact also correct actively damages the test. Bitew et al. show that predictive prompting improves distractor plausibility over prior approaches [6], but the reported ceiling—roughly half of generated distractors rated high quality by teachers—indicates how much room remains. Crucially, the entire line of work optimises for plausibility. None of it asks the question we think is more useful: what does the choice of a particular wrong answer tell us about the learner? A parallel line of work uses LLMs not to generate educational content but to judge it, as Li et al. do for student-generated material in learnersourcing [10]; this is closer to the verification role we describe in Section IV-B, though it has not been applied to checking the grammatical validity of generated distractors.</w:t>
       </w:r>
     </w:p>
     <w:p>
@@ -494,7 +494,7 @@
           <w:color w:val="000000"/>
           <w:sz w:val="20"/>
         </w:rPr>
-        <w:t>If a generated item is to be used adaptively, its difficulty must be estimated before any learner has answered it. Two strands of recent work bear on this. The first asks whether LLMs can judge difficulty directly, and the answer is qualified rather than simply negative. Liu et al. simulate respondents with LLMs and calibrate item parameters from the resulting responses: a single model's item-level parameters correlate well with human-calibrated ones (Spearman above 0.8 for the strongest model tested), but no single model reproduces the full human ability distribution—each LLM's simulated population is narrower and less variable than real test-takers—so only a pooled ensemble of several models approaches that distribution, and augmenting real human data with resampled LLM responses helps calibration only with caveats [12]. The practical reading for a single-generator pipeline like ours is narrower than "LLMs can self-rate difficulty": a single LLM is not a population of learners, and nothing in this result licenses asking one model to introspect about an item's difficulty on its own.</w:t>
+        <w:t>If a generated item is to be used adaptively, its difficulty must be estimated before any learner has answered it. Two strands of recent work bear on this. The first asks whether LLMs can judge difficulty directly, and the answer is qualified rather than simply negative. Liu et al. simulate respondents with LLMs and calibrate item parameters from the resulting responses: a single model's item-level parameters correlate well with human-calibrated ones (Spearman above 0.8 for the strongest model tested), but no single model reproduces the full human ability distribution—each LLM's simulated population is narrower and less variable than real test-takers—so only a pooled ensemble of several models approaches that distribution, and augmenting real human data with resampled LLM responses helps calibration only with caveats [8]. The practical reading for a single-generator pipeline like ours is narrower than "LLMs can self-rate difficulty": a single LLM is not a population of learners, and nothing in this result licenses asking one model to introspect about an item's difficulty on its own.</w:t>
       </w:r>
     </w:p>
     <w:p>
@@ -512,7 +512,7 @@
           <w:color w:val="000000"/>
           <w:sz w:val="20"/>
         </w:rPr>
-        <w:t>The second strand is more encouraging and, for our purposes, decisive. Li et al. treat difficulty estimation as a supervised regression problem over item text and fine-tune language models to solve it [11]. Their central finding is that small encoder models—BERT and RoBERTa, with hundreds of millions of parameters rather than tens of billions—outperform much larger models on this task, achieving a root mean squared error of 0.2926 and beating the winning entry of a shared-task competition. Larger is not better here. The task is a narrow mapping from text to a scalar, with limited labelled data; a compact encoder fine-tuned on exactly that mapping is better matched to it than a general-purpose generative model prompted to introspect. This result directly supports the architecture we propose in Section IV.</w:t>
+        <w:t>The second strand is more encouraging and, for our purposes, decisive. Li et al. treat difficulty estimation as a supervised regression problem over item text and fine-tune language models to solve it [7]. Their central finding is that small encoder models—BERT and RoBERTa, with hundreds of millions of parameters rather than tens of billions—outperform much larger models on this task, achieving a root mean squared error of 0.2926 and beating the winning entry of a shared-task competition. Larger is not better here. The task is a narrow mapping from text to a scalar, with limited labelled data; a compact encoder fine-tuned on exactly that mapping is better matched to it than a general-purpose generative model prompted to introspect. This result directly supports the architecture we propose in Section IV.</w:t>
       </w:r>
     </w:p>
     <w:p>
@@ -546,7 +546,7 @@
           <w:color w:val="000000"/>
           <w:sz w:val="20"/>
         </w:rPr>
-        <w:t>Two traditions address learner modelling, and they are further apart than they should be. The deep learning tradition—knowledge tracing—treats the learner's history as a sequence and trains a neural network to predict the next response. Recent work in this line is sophisticated: Jiang et al. incorporate item difficulty into a multi-view attention architecture [20]; Qian et al. ground an attention mechanism in cognitive theory [21]; Tong and Ren combine knowledge tracing with cognitive load estimation to generate learning paths, reporting 87.5% prediction accuracy and a 24.6% improvement in learning efficiency [19]. Cognitive diagnosis models pursue interpretability within the same broad family, with NeuralCD imposing a monotonicity constraint so that diagnostic output remains meaningful [22] and later work adding multidimensional features [23].</w:t>
+        <w:t>Two traditions address learner modelling, and they are further apart than they should be. The deep learning tradition—knowledge tracing—treats the learner's history as a sequence and trains a neural network to predict the next response. Recent work in this line is sophisticated: Jiang et al. incorporate item difficulty into a multi-view attention architecture [18]; Qian et al. ground an attention mechanism in cognitive theory [19]; Tong and Ren combine knowledge tracing with cognitive load estimation to generate learning paths, reporting 87.5% prediction accuracy and a 24.6% improvement in learning efficiency [17]. Cognitive diagnosis models pursue interpretability within the same broad family, with NeuralCD imposing a monotonicity constraint so that diagnostic output remains meaningful [20] and later work adding multidimensional features [21].</w:t>
       </w:r>
     </w:p>
     <w:p>
@@ -564,7 +564,7 @@
           <w:color w:val="000000"/>
           <w:sz w:val="20"/>
         </w:rPr>
-        <w:t>A related strand models the learner as a persistent profile rather than a response sequence: Aydın and Yurdugül construct a “learner digital twin” from accumulated experience and use it to select instructional scaffolding [32]. This shares our motivation of maintaining an explicit, inspectable learner representation, though it does not address item calibration.</w:t>
+        <w:t>A related strand models the learner as a persistent profile rather than a response sequence: Aydın and Yurdugül construct a “learner digital twin” from accumulated experience and use it to select instructional scaffolding [30]. This shares our motivation of maintaining an explicit, inspectable learner representation, though it does not address item calibration.</w:t>
       </w:r>
     </w:p>
     <w:p>
@@ -600,7 +600,7 @@
           <w:color w:val="000000"/>
           <w:sz w:val="20"/>
         </w:rPr>
-        <w:t>The psychometric tradition takes the opposite approach: a small number of explicit, interpretable parameters updated by a transparent rule. The Elo rating system, borrowed from chess, is the workhorse. Each learner and each item carries a single number; after every response both numbers move towards or away from each other in proportion to how surprising the outcome was. It is trivial to implement, needs no training data, and updates in constant time, which is why it underpins deployed adaptive platforms [18]. Section III-B explains why, despite these virtues, it is the wrong choice for the system we are describing.</w:t>
+        <w:t>The psychometric tradition takes the opposite approach: a small number of explicit, interpretable parameters updated by a transparent rule. The Elo rating system, borrowed from chess, is the workhorse. Each learner and each item carries a single number; after every response both numbers move towards or away from each other in proportion to how surprising the outcome was. It is trivial to implement, needs no training data, and updates in constant time, which is why it underpins deployed adaptive platforms [16]. Even inside such deployments, though, plain Elo keeps needing patches: a recent audit of a large-scale deployed system finds item drift and an unmodelled speed–accuracy tradeoff [14], and separate work finds its fixed update size forces a tradeoff between tracking real ability change and rating volatility, proposing a dynamically adjusted update size instead [15]. Section III-B explains why, despite these virtues, it is the wrong choice for the system we are describing.</w:t>
       </w:r>
     </w:p>
     <w:p>
@@ -618,7 +618,7 @@
           <w:color w:val="000000"/>
           <w:sz w:val="20"/>
         </w:rPr>
-        <w:t>The Urnings algorithm offers an alternative with the same operational simplicity and better statistical behaviour [16]. Each learner and item is represented not by a point estimate but by an urn containing a fixed number of balls, some green and some red; the proportion of green balls is the current estimate and the number of balls controls its precision. Updates exchange balls between the learner's urn and the item's urn, with a Metropolis–Hastings correction that keeps the procedure statistically honest. Because the urn has a fixed size, the estimate comes with a known standard error—something Elo cannot provide—and the algorithm explicitly corrects for the distortion introduced when items are chosen adaptively. It extends naturally to tracking several abilities at once [16], and recent work augments it with response times [17].</w:t>
+        <w:t>The Urnings algorithm offers an alternative with the same operational simplicity and better statistical behaviour [12]. Each learner and item is represented not by a point estimate but by an urn containing a fixed number of balls, some green and some red; the proportion of green balls is the current estimate and the number of balls controls its precision. Updates exchange balls between the learner's urn and the item's urn, with a Metropolis–Hastings correction that keeps the procedure statistically honest. Because the urn has a fixed size, the estimate comes with a known standard error—something Elo cannot provide—and the algorithm explicitly corrects for the distortion introduced when items are chosen adaptively. It extends naturally to tracking several abilities at once [12], and recent work augments it with response times [13].</w:t>
       </w:r>
     </w:p>
     <w:p>
@@ -652,7 +652,7 @@
           <w:color w:val="000000"/>
           <w:sz w:val="20"/>
         </w:rPr>
-        <w:t>Korean-specific resources have matured considerably. Song et al. substantially enrich the Korean learner corpus for grammatical error correction and writing assessment [24], building on earlier error-annotated collections; Chun and Kim analyse substitution errors between topic and nominative markers in a learner corpus and derive pedagogical applications from them [25]. On the modelling side, Yu et al.'s KRongBERT demonstrates that explicitly accounting for Korean morphology in a pre-trained encoder improves downstream performance [26], a reminder that Korean's agglutinative structure is not something a general multilingual model handles for free.</w:t>
+        <w:t>Korean-specific resources have matured considerably. Song et al. substantially enrich the Korean learner corpus for grammatical error correction and writing assessment [22], building on earlier error-annotated collections; Chun and Kim analyse substitution errors between topic and nominative markers in a learner corpus and derive pedagogical applications from them [23]. On the modelling side, Yu et al.'s KRongBERT demonstrates that explicitly accounting for Korean morphology in a pre-trained encoder improves downstream performance [24], a reminder that Korean's agglutinative structure is not something a general multilingual model handles for free.</w:t>
       </w:r>
     </w:p>
     <w:p>
@@ -670,7 +670,7 @@
           <w:color w:val="000000"/>
           <w:sz w:val="20"/>
         </w:rPr>
-        <w:t>Work on AI in Korean language teaching has so far concentrated on conversation and motivation rather than on structured assessment. Hong and Yang evaluate a mobile-assisted blended Korean course and report gains in both proficiency and affective outcomes [1]. Related work in second language learning more broadly examines generative AI chatbots for speaking practice [3], vocabulary and reading development [4], and the redistribution of agency between learner, teacher and machine that generative tools bring about [2]. Assessment-focused studies, meanwhile, concentrate on scoring learner production rather than generating practice: automated essay scoring with LLMs has been examined for validity and reliability with mixed conclusions [30], [31].</w:t>
+        <w:t>Generative AI applied specifically to Korean language pedagogy is thin next to the NLP resources above: the broader second-language-learning literature discusses the redistribution of agency between learner, teacher and machine that generative tools bring about [1], but structured, difficulty-calibrated assessment is not its focus. Assessment-focused studies, meanwhile, concentrate on scoring learner production rather than generating practice: automated essay scoring with LLMs has been examined for validity and reliability with mixed conclusions [28], [29].</w:t>
       </w:r>
     </w:p>
     <w:p>
@@ -704,7 +704,7 @@
           <w:color w:val="000000"/>
           <w:sz w:val="20"/>
         </w:rPr>
-        <w:t>Before proposing new methods it is worth asking what the most successful deployed practice systems already do, since reviewers familiar with Duolingo or similar products will ask the same question. The honest answer is that there is no single industry standard — four of the most-cited systems solve the problem four different ways. Duolingo's practice app schedules review using Half-Life Regression [28], a lightweight model trained on thirteen million learning traces, since evolved into Birdbrain, an LSTM-based system reported to process tens of billions of predictions daily across the product's user base [37]. The Duolingo English Test, a separate system from the practice app, instead scores test-takers with classical item response theory inside a computerised-adaptive-testing framework [38]. ALEKS, a widely deployed mathematics tutor, uses neither: it is built on knowledge space theory, a combinatorial framework that represents a learner's state as the precise subset of skills mastered and selects items that move the learner to an adjacent reachable state [39]. Math Garden uses the Elo-based design discussed in Section III-B [40]. Anki's default scheduler, FSRS, fits a compact per-card memory model from review history [41].</w:t>
+        <w:t>Before proposing new methods it is worth asking what the most successful deployed practice systems already do, since reviewers familiar with Duolingo or similar products will ask the same question. The honest answer is that there is no single industry standard — four of the most-cited systems solve the problem four different ways. Duolingo's practice app schedules review using Half-Life Regression [26], a lightweight model trained on thirteen million learning traces, since evolved into Birdbrain, an LSTM-based system reported to process tens of billions of predictions daily across the product's user base [35]. The Duolingo English Test, a separate system from the practice app, instead scores test-takers with classical item response theory inside a computerised-adaptive-testing framework [36]. ALEKS, a widely deployed mathematics tutor, uses neither: it is built on knowledge space theory, a combinatorial framework that represents a learner's state as the precise subset of skills mastered and selects items that move the learner to an adjacent reachable state [37]. Math Garden uses the Elo-based design discussed in Section III-B [38]. Anki's default scheduler, FSRS, fits a compact per-card memory model from review history [39].</w:t>
       </w:r>
     </w:p>
     <w:p>
@@ -758,7 +758,7 @@
           <w:color w:val="000000"/>
           <w:sz w:val="20"/>
         </w:rPr>
-        <w:t>This reframes the contribution of the present paper. It is not an attempt to out-engineer Birdbrain, which would be a poor use of effort given the data gap just described. It is an attempt to reproduce, for a research team without a professional content-authoring organisation, the adaptive quality that large-scale systems achieve by combining editorial labour with classical or lightly-parameterised statistical models. We therefore follow industry practice exactly where our data regime matches theirs — classical or lightweight trackers over learner ability, and a decay-based scheduler over review timing, in the spirit of [28] and [41] — and depart from it only where our resource constraint, not our technical ambition, forces a different answer: generating and calibrating items we cannot afford to commission.</w:t>
+        <w:t>This reframes the contribution of the present paper. It is not an attempt to out-engineer Birdbrain, which would be a poor use of effort given the data gap just described. It is an attempt to reproduce, for a research team without a professional content-authoring organisation, the adaptive quality that large-scale systems achieve by combining editorial labour with classical or lightly-parameterised statistical models. We therefore follow industry practice exactly where our data regime matches theirs — classical or lightweight trackers over learner ability, and a decay-based scheduler over review timing, in the spirit of [26] and [39] — and depart from it only where our resource constraint, not our technical ambition, forces a different answer: generating and calibrating items we cannot afford to commission.</w:t>
       </w:r>
     </w:p>
     <w:p>
@@ -810,7 +810,7 @@
           <w:color w:val="000000"/>
           <w:sz w:val="20"/>
         </w:rPr>
-        <w:t>G1. Wrong answers are wasted. Distractors are optimised to be plausible [10], not to be informative. When a learner selects a particular wrong answer they have revealed something quite specific about their internal model of the grammar, and current systems discard that signal, recording only a binary outcome. Cognitive diagnosis models would make use of it [22], [23], but they require a pre-specified mapping from items to skills that generated items do not come with.</w:t>
+        <w:t>G1. Wrong answers are wasted. Distractors are optimised to be plausible [6], not to be informative. When a learner selects a particular wrong answer they have revealed something quite specific about their internal model of the grammar, and current systems discard that signal, recording only a binary outcome. Cognitive diagnosis models would make use of it [20], [21], but they require a pre-specified mapping from items to skills that generated items do not come with.</w:t>
       </w:r>
     </w:p>
     <w:p>
@@ -828,7 +828,7 @@
           <w:color w:val="000000"/>
           <w:sz w:val="20"/>
         </w:rPr>
-        <w:t>G2. Rating systems are used outside their validity conditions. Elo is deployed in adaptive platforms [18] in the one configuration where its measurement properties break down—simultaneous adaptive item selection and dynamic item calibration—and this has only recently been characterised precisely [15]. A generative item pool forces exactly that configuration, because items must be calibrated as they are used. We are not aware of any language learning system that uses Urnings.</w:t>
+        <w:t>G2. Rating systems are used outside their validity conditions. Elo is deployed in adaptive platforms [16] in the one configuration where its measurement properties break down—simultaneous adaptive item selection and dynamic item calibration—and this has only recently been characterised precisely [11]. A generative item pool forces exactly that configuration, because items must be calibrated as they are used. We are not aware of any language learning system that uses Urnings.</w:t>
       </w:r>
     </w:p>
     <w:p>
@@ -846,7 +846,7 @@
           <w:color w:val="000000"/>
           <w:sz w:val="20"/>
         </w:rPr>
-        <w:t>G3. Feedback is generated uniformly, and its benefits are not. Thomas et al., studying on-demand LLM explanatory feedback across seven lessons with 885 learners, found statistically significant benefits in only two of them, with effect sizes of 0.28 and 0.33 after adjusting for learners' propensity to request feedback [29]. Feedback is not uniformly valuable, yet systems generate it uniformly, at uniform cost. No existing work allocates generative effort according to how much the system stands to learn from the interaction.</w:t>
+        <w:t>G3. Feedback is generated uniformly, and its benefits are not. Thomas et al., studying on-demand LLM explanatory feedback across seven lessons with 885 learners, found statistically significant benefits in only two of them, with effect sizes of 0.28 and 0.33 after adjusting for learners' propensity to request feedback [27]. Feedback is not uniformly valuable, yet systems generate it uniformly, at uniform cost. No existing work allocates generative effort according to how much the system stands to learn from the interaction.</w:t>
       </w:r>
     </w:p>
     <w:p>
@@ -950,7 +950,7 @@
           <w:color w:val="000000"/>
           <w:sz w:val="20"/>
         </w:rPr>
-        <w:t>Predicting difficulty from item text. Deep learning is appropriate, but the instrument should be small. This is a supervised regression from a short text to a scalar, with training data measured in thousands rather than millions of examples. Li et al.'s finding that fine-tuned BERT-class encoders outperform far larger models on precisely this task [11] is not an anomaly; it reflects the match between a compact discriminative model and a narrow mapping. A small encoder is also cheap enough to run on every generated item in real time, deterministic, and straightforward to recalibrate on local response data as it accumulates.</w:t>
+        <w:t>Predicting difficulty from item text. Deep learning is appropriate, but the instrument should be small. This is a supervised regression from a short text to a scalar, with training data measured in thousands rather than millions of examples. Li et al.'s finding that fine-tuned BERT-class encoders outperform far larger models on precisely this task [7] is not an anomaly; it reflects the match between a compact discriminative model and a narrow mapping. A small encoder is also cheap enough to run on every generated item in real time, deterministic, and straightforward to recalibrate on local response data as it accumulates.</w:t>
       </w:r>
     </w:p>
     <w:p>
@@ -1020,7 +1020,7 @@
           <w:color w:val="000000"/>
           <w:sz w:val="20"/>
         </w:rPr>
-        <w:t>No—and this is the clearest-cut of the three questions. Elo is the default in adaptive practice platforms [18] for good reasons: one number per learner, one per item, constant-time updates, no training phase. But Bolsinova et al. have recently characterised its failure mode with precision, and the configuration in which it fails is exactly the one a generative drill system is forced into [15].</w:t>
+        <w:t>No—and this is the clearest-cut of the three questions. Elo is the default in adaptive practice platforms [16] for good reasons: one number per learner, one per item, constant-time updates, no training phase. But Bolsinova et al. have recently characterised its failure mode with precision, and the configuration in which it fails is exactly the one a generative drill system is forced into [11].</w:t>
       </w:r>
     </w:p>
     <w:p>
@@ -1074,7 +1074,7 @@
           <w:color w:val="000000"/>
           <w:sz w:val="20"/>
         </w:rPr>
-        <w:t>Two remedies are available. Parallel Elo, proposed in [16], maintains two independent rating chains updated on alternating responses and selects items using whichever chain is not currently being updated, which breaks the dependence between selection and current error. In our simulation it reduces terminal spread from 2.69 to 1.71 and terminal error from 1.70 to 0.73—a clear improvement that does not fully resolve the problem. The Urnings algorithm [16] performs better still, holding spread at 1.11 against the true 1.04 and error at 0.43, flat rather than rising. Urnings also provides what the selection policy actually needs and Elo cannot give: a calibrated standard error. We adopt Urnings as the tracker, and retain Elo and Parallel Elo as baselines in Section V so that the contribution of this choice can be measured rather than asserted.</w:t>
+        <w:t>Two remedies are available. Parallel Elo, proposed in [12], maintains two independent rating chains updated on alternating responses and selects items using whichever chain is not currently being updated, which breaks the dependence between selection and current error. In our simulation it reduces terminal spread from 2.69 to 1.71 and terminal error from 1.70 to 0.73—a clear improvement that does not fully resolve the problem. The Urnings algorithm [12] performs better still, holding spread at 1.11 against the true 1.04 and error at 0.43, flat rather than rising. Urnings also provides what the selection policy actually needs and Elo cannot give: a calibrated standard error. We adopt Urnings as the tracker, and retain Elo and Parallel Elo as baselines in Section V so that the contribution of this choice can be measured rather than asserted.</w:t>
       </w:r>
     </w:p>
     <w:p>
@@ -1143,7 +1143,7 @@
           <w:color w:val="000000"/>
           <w:sz w:val="16"/>
         </w:rPr>
-        <w:t>Fig. 4. Motivating simulation, no item-difficulty prior injected: 120,000 responses, 300 learners, 400 items, Rasch generating model, with adaptive selection and simultaneous item calibration — the regime a generative item pool forces. (a) Elo's rating spread inflates to 2.69 against a true value of 1.04 and is still rising; Urnings holds at 1.11. (b) Elo's error against true ability grows after roughly 15,000 responses, so the estimates get worse as more data arrives. This reproduces, at realistic scale, the failure characterised analytically by Bolsinova et al. [15]; Section IV-C/V-C repeat it with a genuinely uncalibrated prior injected, Novelty 2's own evidence.</w:t>
+        <w:t>Fig. 4. Motivating simulation, no item-difficulty prior injected: 120,000 responses, 300 learners, 400 items, Rasch generating model, with adaptive selection and simultaneous item calibration — the regime a generative item pool forces. (a) Elo's rating spread inflates to 2.69 against a true value of 1.04 and is still rising; Urnings holds at 1.11. (b) Elo's error against true ability grows after roughly 15,000 responses, so the estimates get worse as more data arrives. This reproduces, at realistic scale, the failure characterised analytically by Bolsinova et al. [11]; Section IV-C/V-C repeat it with a genuinely uncalibrated prior injected, Novelty 2's own evidence.</w:t>
       </w:r>
     </w:p>
     <w:p>
@@ -1207,7 +1207,7 @@
           <w:color w:val="000000"/>
           <w:sz w:val="20"/>
         </w:rPr>
-        <w:t>A further argument against Elo is dimensional. Elo assigns one number per learner, but Korean proficiency is not one thing. A learner may handle particles well and honorifics poorly. Collapsing this into a scalar discards the structure that makes personalisation worthwhile. Urnings extends naturally to tracking many abilities simultaneously [16], which is what the diagnostic scheme in Section IV-B requires.</w:t>
+        <w:t>A further argument against Elo is dimensional. Elo assigns one number per learner, but Korean proficiency is not one thing. A learner may handle particles well and honorifics poorly. Collapsing this into a scalar discards the structure that makes personalisation worthwhile. Urnings extends naturally to tracking many abilities simultaneously [12], which is what the diagnostic scheme in Section IV-B requires.</w:t>
       </w:r>
     </w:p>
     <w:p>
@@ -1259,7 +1259,7 @@
           <w:color w:val="000000"/>
           <w:sz w:val="20"/>
         </w:rPr>
-        <w:t>Korean generation: EXAONE. LG AI Research's EXAONE family [34] is trained with Korean as a first-class language rather than as one of many, which matters in two concrete ways. Its tokeniser segments Hangul efficiently, reducing both cost and the morphological fragmentation that inflates sequence length for Korean in English-centric tokenisers—the same consideration that motivates KRongBERT's morphological factorisation [26]. EXAONE's role in this system is generation only (item stems, verb lemmas), and its non-reasoning mode is sufficient for that narrow task throughout—we do not exercise its reasoning mode anywhere, so we do not claim its hybrid design as a property this system relies on. The escalation policy in Section IV-D switches Qwen3 between its modes, not EXAONE. The main caveat on EXAONE is licensing: it is released under terms restricting commercial use, which is unproblematic for research but must be disclosed, and which is a reason to retain a permissively licensed fallback.</w:t>
+        <w:t>Korean generation: EXAONE. LG AI Research's EXAONE family [32] is trained with Korean as a first-class language rather than as one of many, which matters in two concrete ways. Its tokeniser segments Hangul efficiently, reducing both cost and the morphological fragmentation that inflates sequence length for Korean in English-centric tokenisers—the same consideration that motivates KRongBERT's morphological factorisation [24]. EXAONE's role in this system is generation only (item stems, verb lemmas), and its non-reasoning mode is sufficient for that narrow task throughout—we do not exercise its reasoning mode anywhere, so we do not claim its hybrid design as a property this system relies on. The escalation policy in Section IV-D switches Qwen3 between its modes, not EXAONE. The main caveat on EXAONE is licensing: it is released under terms restricting commercial use, which is unproblematic for research but must be disclosed, and which is a reason to retain a permissively licensed fallback.</w:t>
       </w:r>
     </w:p>
     <w:p>
@@ -1277,7 +1277,7 @@
           <w:color w:val="000000"/>
           <w:sz w:val="20"/>
         </w:rPr>
-        <w:t>English explanatory feedback: Qwen3. The user-facing explanation is a cross-lingual task, not an English one: the model must reason about Korean morphology while writing in English. This favours a model with strong multilingual grounding, and Qwen3 [35], pre-trained across 119 languages with a large vocabulary and documented strength on CJK languages, is a better fit than a model whose multilingual coverage is broad but shallower on Korean. Gemma-class models are a reasonable alternative where a smaller footprint or vision input is required; we treat the choice as an ablation rather than a commitment.</w:t>
+        <w:t>English explanatory feedback: Qwen3. The user-facing explanation is a cross-lingual task, not an English one: the model must reason about Korean morphology while writing in English. This favours a model with strong multilingual grounding, and Qwen3 [33], pre-trained across 119 languages with a large vocabulary and documented strength on CJK languages, is a better fit than a model whose multilingual coverage is broad but shallower on Korean. Gemma-class models are a reasonable alternative where a smaller footprint or vision input is required; we treat the choice as an ablation rather than a commitment.</w:t>
       </w:r>
     </w:p>
     <w:p>
@@ -1295,7 +1295,7 @@
           <w:color w:val="000000"/>
           <w:sz w:val="20"/>
         </w:rPr>
-        <w:t>Difficulty prediction: KLUE-RoBERTa. We endorse this without reservation as the target architecture. A Korean encoder pre-trained on the KLUE benchmark suite [36] and fine-tuned for difficulty regression is the right instrument for the reasons given in Section III-A and directly supported by Li et al. [11]. Our one refinement is that the encoder should not emit a point estimate. It should emit a mean and a variance, because that distribution becomes the prior for the psychometric tracker, and an item the encoder is unsure about should enter the pool with correspondingly wide uncertainty rather than with false confidence. This feeds directly into the adaptive selection policy described in Section IV-D.</w:t>
+        <w:t>Difficulty prediction: KLUE-RoBERTa. We endorse this without reservation as the target architecture. A Korean encoder pre-trained on the KLUE benchmark suite [34] and fine-tuned for difficulty regression is the right instrument for the reasons given in Section III-A and directly supported by Li et al. [7]. Our one refinement is that the encoder should not emit a point estimate. It should emit a mean and a variance, because that distribution becomes the prior for the psychometric tracker, and an item the encoder is unsure about should enter the pool with correspondingly wide uncertainty rather than with false confidence. This feeds directly into the adaptive selection policy described in Section IV-D.</w:t>
       </w:r>
     </w:p>
     <w:p>
@@ -1704,7 +1704,7 @@
           <w:color w:val="000000"/>
           <w:sz w:val="20"/>
         </w:rPr>
-        <w:t>Rather than inventing a project-specific error scheme, we ground the taxonomy ℳ in KAGAS, the 14-category Korean Automatic Grammatical error Annotation System [24], which already defines and independently validates categories spanning particle substitution, honorific agreement, and verb-conjugation errors, among others. Using an external, independently defined taxonomy rather than one we compiled ourselves matters for auditability: the diagnostic label a distractor carries is not a judgement call this paper made alone. Rather than asking the generator for plausible wrong answers, we condition it: for a sampled category m</w:t>
+        <w:t>Rather than inventing a project-specific error scheme, we ground the taxonomy ℳ in KAGAS, the 14-category Korean Automatic Grammatical error Annotation System [22], which already defines and independently validates categories spanning particle substitution, honorific agreement, and verb-conjugation errors, among others. Using an external, independently defined taxonomy rather than one we compiled ourselves matters for auditability: the diagnostic label a distractor carries is not a judgement call this paper made alone. Rather than asking the generator for plausible wrong answers, we condition it: for a sampled category m</w:t>
       </w:r>
       <w:r>
         <w:rPr>
@@ -1764,7 +1764,7 @@
           <w:color w:val="000000"/>
           <w:sz w:val="20"/>
         </w:rPr>
-        <w:t>This inverts the usual relationship between item and skill mapping. Cognitive diagnosis models require a matrix mapping items to skills, supplied by experts [22], [23]; here the mapping is a by-product of generation, because the system knows which misconception it asked for. Diagnosis then becomes almost trivial: a learner who selects d</w:t>
+        <w:t>This inverts the usual relationship between item and skill mapping. Cognitive diagnosis models require a matrix mapping items to skills, supplied by experts [20], [21]; here the mapping is a by-product of generation, because the system knows which misconception it asked for. Diagnosis then becomes almost trivial: a learner who selects d</w:t>
       </w:r>
       <w:r>
         <w:rPr>
@@ -2025,7 +2025,7 @@
           <w:color w:val="000000"/>
           <w:sz w:val="20"/>
         </w:rPr>
-        <w:t>One further design decision deserves explicit defence because it departs from convention, and we are precise about how much weight its justification actually carries rather than citing it as settled. Classical adaptive testing selects the item that maximises information about the learner, which for a Rasch model means an item the learner has roughly a 50% chance of answering correctly. That is optimal if the goal is to measure someone efficiently. It is not optimal if the goal is to help them learn: a 50% success rate is demoralising over a long practice session. Wilson et al. derive 85% as the optimal training accuracy for gradient-descent binary classifiers, and are explicit that this is not a universal constant to target in every setting [27]—we do not claim stronger support from that result than the authors themselves do. What does transfer is the qualitative shape of the argument, independently supported in human learning specifically by the desirable-difficulties literature: moderate, well-calibrated challenge produces more durable learning than either trivial or overwhelming difficulty [44]. We treat 85% as a principled starting point motivated by both, not a value proven optimal for Korean grammar drilling, and the discrimination-index check below is in part how we verify this starting point is not actively harmful. We therefore select</w:t>
+        <w:t>One further design decision deserves explicit defence because it departs from convention, and we are precise about how much weight its justification actually carries rather than citing it as settled. Classical adaptive testing selects the item that maximises information about the learner, which for a Rasch model means an item the learner has roughly a 50% chance of answering correctly. That is optimal if the goal is to measure someone efficiently. It is not optimal if the goal is to help them learn: a 50% success rate is demoralising over a long practice session. Wilson et al. derive 85% as the optimal training accuracy for gradient-descent binary classifiers, and are explicit that this is not a universal constant to target in every setting [25]—we do not claim stronger support from that result than the authors themselves do. What does transfer is the qualitative shape of the argument, independently supported in human learning specifically by the desirable-difficulties literature: moderate, well-calibrated challenge produces more durable learning than either trivial or overwhelming difficulty [42]. We treat 85% as a principled starting point motivated by both, not a value proven optimal for Korean grammar drilling, and the discrimination-index check below is in part how we verify this starting point is not actively harmful. We therefore select</w:t>
       </w:r>
     </w:p>
     <w:p>
@@ -2129,7 +2129,7 @@
           <w:color w:val="000000"/>
           <w:sz w:val="20"/>
         </w:rPr>
-        <w:t>restricted to items targeting the skill with the greatest expected pedagogical return. This deliberately sacrifices measurement efficiency for learning efficiency, and we now put a number on that cost rather than leave the trade-off purely stated. Using the point-biserial discrimination index—the classical test-theory measure of whether a correct response on an item actually distinguishes stronger from weaker learners—we simulate a field-test population (θ ~ N(0,1), 2000 learners, 40 replications per difficulty) and evaluate it at the item difficulty each policy implies for an average-ability learner. The maximum-information target (β=0, 50% success) gives discrimination 0.41; our 85%-target policy (β=θ̂−logit(0.15), by Eq. 2) gives 0.34—both comfortably in the conventionally "good" range (≥0.30), an 18% relative drop rather than a qualitative one. The trade-off is real, as stated, but the items this policy serves remain psychometrically sound; this was not previously measured and is not assumed. Vocabulary scheduling across sessions follows a spacing model in the tradition of half-life regression [28], with the tracker posterior supplying the ability term; grammar skills are scheduled differently, stated plainly rather than left for a reader to assume the same mechanism applies to both. A generated grammar item is mostly non-repeating, so there is no fixed card for a half-life model to space—a skill is simply due whenever it is not yet mastered. Mastery itself has no time-based decay under Urnings, so a mastered skill still needs a periodic low-priority recheck to stay revocable in practice; we currently use a flat 30-day interval, an explicit placeholder rather than a derived constant. We tried deriving one from FSRS's own forgetting-curve math first rather than guessing a different number: it does not transfer, because FSRS's growing intervals assume each simulated review is spaced, and feeding it many correct-in-a-row Urnings responses to model "mastered" inflates the derived interval to tens of thousands of days—a different question (long-term fact retention) than the one we are actually asking (how much practice evidence constitutes mastery). No Korean-skill-retention dataset exists to fit a principled interval instead, the same data gap underlying Section III-C's difficulty-prior placeholder; what is logged in the meantime is every recheck outcome, so the interval can be tuned from evidence once usage data exists rather than left an untuned guess indefinitely.</w:t>
+        <w:t>restricted to items targeting the skill with the greatest expected pedagogical return. This deliberately sacrifices measurement efficiency for learning efficiency, and we now put a number on that cost rather than leave the trade-off purely stated. Using the point-biserial discrimination index—the classical test-theory measure of whether a correct response on an item actually distinguishes stronger from weaker learners—we simulate a field-test population (θ ~ N(0,1), 2000 learners, 40 replications per difficulty) and evaluate it at the item difficulty each policy implies for an average-ability learner. The maximum-information target (β=0, 50% success) gives discrimination 0.41; our 85%-target policy (β=θ̂−logit(0.15), by Eq. 2) gives 0.34—both comfortably in the conventionally "good" range (≥0.30), an 18% relative drop rather than a qualitative one. The trade-off is real, as stated, but the items this policy serves remain psychometrically sound; this was not previously measured and is not assumed. Vocabulary scheduling across sessions follows a spacing model in the tradition of half-life regression [26], with the tracker posterior supplying the ability term; grammar skills are scheduled differently, stated plainly rather than left for a reader to assume the same mechanism applies to both. A generated grammar item is mostly non-repeating, so there is no fixed card for a half-life model to space—a skill is simply due whenever it is not yet mastered. Mastery itself has no time-based decay under Urnings, so a mastered skill still needs a periodic low-priority recheck to stay revocable in practice; we currently use a flat 30-day interval, an explicit placeholder rather than a derived constant. We tried deriving one from FSRS's own forgetting-curve math first rather than guessing a different number: it does not transfer, because FSRS's growing intervals assume each simulated review is spaced, and feeding it many correct-in-a-row Urnings responses to model "mastered" inflates the derived interval to tens of thousands of days—a different question (long-term fact retention) than the one we are actually asking (how much practice evidence constitutes mastery). No Korean-skill-retention dataset exists to fit a principled interval instead, the same data gap underlying Section III-C's difficulty-prior placeholder; what is logged in the meantime is every recheck outcome, so the interval can be tuned from evidence once usage data exists rather than left an untuned guess indefinitely.</w:t>
       </w:r>
     </w:p>
     <w:p>
@@ -2251,7 +2251,7 @@
           <w:color w:val="000000"/>
           <w:sz w:val="20"/>
         </w:rPr>
-        <w:t>This targets gap G3—that feedback is generated uniformly although its benefits are not [29]—economically and pedagogically: reasoning-mode inference is substantially more expensive, and the finding that LLM feedback produced significant gains in only two of seven lessons [29] suggests uniform feedback dilutes its own effect. We deliberately do not claim w</w:t>
+        <w:t>This targets gap G3—that feedback is generated uniformly although its benefits are not [27]—economically and pedagogically: reasoning-mode inference is substantially more expensive, and the finding that LLM feedback produced significant gains in only two of seven lessons [27] suggests uniform feedback dilutes its own effect. We deliberately do not claim w</w:t>
       </w:r>
       <w:r>
         <w:rPr>
@@ -2293,7 +2293,7 @@
           <w:color w:val="000000"/>
           <w:sz w:val="20"/>
         </w:rPr>
-        <w:t>, true error) = −0.76, and a regression-calibration check [42], [43] finds credible intervals built from w</w:t>
+        <w:t>, true error) = −0.76, and a regression-calibration check [40], [41] finds credible intervals built from w</w:t>
       </w:r>
       <w:r>
         <w:rPr>
@@ -2462,7 +2462,7 @@
           <w:color w:val="000000"/>
           <w:sz w:val="20"/>
         </w:rPr>
-        <w:t>The target curriculum this architecture is designed for is a TOPIK-aligned syllabus spanning levels I through IV, roughly 120 discrete grammatical points; what is actually built and evaluated here is 11 skills (Section IV-B lists them), covering 7 of the 7 relevant KAGAS part-of-speech categories. The gap between 120 and 11 is simply unimplemented coverage, not a claim about what has been tested—every number in Section V-B below is reported at the 11-skill scale, never projected onto the full syllabus. The misconception taxonomy is KAGAS [24], the 14-category Korean grammatical error taxonomy, rather than a project-specific scheme, so that the diagnostic labels a generated distractor carries are independently defined and independently auditable. All generated items entering any evaluation are reviewed by qualified Korean instructors first; we report, but do not act on, the verifier's agreement with those reviewers, so that the verifier's standalone accuracy can be measured on its own terms.</w:t>
+        <w:t>The target curriculum this architecture is designed for is a TOPIK-aligned syllabus spanning levels I through IV, roughly 120 discrete grammatical points; what is actually built and evaluated here is 11 skills (Section IV-B lists them), covering 7 of the 7 relevant KAGAS part-of-speech categories. The gap between 120 and 11 is simply unimplemented coverage, not a claim about what has been tested—every number in Section V-B below is reported at the 11-skill scale, never projected onto the full syllabus. The misconception taxonomy is KAGAS [22], the 14-category Korean grammatical error taxonomy, rather than a project-specific scheme, so that the diagnostic labels a generated distractor carries are independently defined and independently auditable. All generated items entering any evaluation are reviewed by qualified Korean instructors first; we report, but do not act on, the verifier's agreement with those reviewers, so that the verifier's standalone accuracy can be measured on its own terms.</w:t>
       </w:r>
     </w:p>
     <w:p>
@@ -2514,7 +2514,7 @@
           <w:color w:val="000000"/>
           <w:sz w:val="20"/>
         </w:rPr>
-        <w:t>Item quality is rated by three independent Korean language instructors on four dimensions — grammaticality of the stem, uniqueness of the key, plausibility of each distractor, and correctness of the KAGAS label — with agreement reported as Fleiss' κ. Two measures matter most. First, the rate of items containing more than one defensible answer, since this is the failure the verifier gate in Section IV-B exists specifically to catch, and it is the one the general distractor-generation literature does not report [10]. Second, agreement between the KAGAS label a distractor was generated to realise and the label an instructor independently assigns after seeing only the distractor — this is the direct test of whether misconception-conditioning actually produces a usable diagnosis, or merely a plausible wrong answer with a label attached. Neither measure is available yet; this subsection is the protocol, not a result.</w:t>
+        <w:t>Item quality is rated by three independent Korean language instructors on four dimensions — grammaticality of the stem, uniqueness of the key, plausibility of each distractor, and correctness of the KAGAS label — with agreement reported as Fleiss' κ. Two measures matter most. First, the rate of items containing more than one defensible answer, since this is the failure the verifier gate in Section IV-B exists specifically to catch, and it is the one the general distractor-generation literature does not report [6]. Second, agreement between the KAGAS label a distractor was generated to realise and the label an instructor independently assigns after seeing only the distractor — this is the direct test of whether misconception-conditioning actually produces a usable diagnosis, or merely a plausible wrong answer with a label attached. Neither measure is available yet; this subsection is the protocol, not a result.</w:t>
       </w:r>
     </w:p>
     <w:p>
@@ -2618,7 +2618,7 @@
           <w:color w:val="000000"/>
           <w:sz w:val="20"/>
         </w:rPr>
-        <w:t>Fig. 5 summarises the design, offered as secondary evidence of real-world usefulness rather than as the paper's central claim. We recruit learners of Korean as a foreign language at CEFR A2–B1 equivalent, block-randomised by placement score into three arms. Arm A receives a fixed expert-authored item bank in random order. Arm B receives the same fixed bank with Elo-based adaptive selection, representing current good practice [18]. Arm C receives the full KO-DRILL system. Arms A and B share an item bank so that the effect of generation is separable from the effect of adaptivity. Running this pilot at the full scale implied by Fig. 5 — three arms of 60 — is desirable but not required before the claims in Subsections B through C can be reported; a smaller single-cohort pilot comparing only Arm A against Arm C is a reasonable first step if resources are limited, at the cost of not separating the generation and adaptivity effects.</w:t>
+        <w:t>Fig. 5 summarises the design, offered as secondary evidence of real-world usefulness rather than as the paper's central claim. We recruit learners of Korean as a foreign language at CEFR A2–B1 equivalent, block-randomised by placement score into three arms. Arm A receives a fixed expert-authored item bank in random order. Arm B receives the same fixed bank with Elo-based adaptive selection, representing current good practice [16]. Arm C receives the full KO-DRILL system. Arms A and B share an item bank so that the effect of generation is separable from the effect of adaptivity. Running this pilot at the full scale implied by Fig. 5 — three arms of 60 — is desirable but not required before the claims in Subsections B through C can be reported; a smaller single-cohort pilot comparing only Arm A against Arm C is a reasonable first step if resources are limited, at the cost of not separating the generation and adaptivity effects.</w:t>
       </w:r>
     </w:p>
     <w:p>
@@ -2636,7 +2636,7 @@
           <w:color w:val="000000"/>
           <w:sz w:val="20"/>
         </w:rPr>
-        <w:t>Participants complete a TOPIK-aligned pre-test, six weeks of practice, an immediate post-test, and a delayed retention test four weeks later. The primary outcome is normalised learning gain on the post-test; secondary outcomes are retention, items-to-mastery, per-skill diagnostic accuracy against instructor judgement, and completion rate. We note plainly that a sample of 60 per arm gives 80% power to detect a standardised between-arm difference of only d = 0.51 two-sided, or d = 0.59 Bonferroni-corrected across the three pairwise comparisons — larger than the 0.28–0.33 range reported for LLM feedback alone [29]. This is a known limitation of the pilot, not of the paper's technical claims, which is exactly why Subsections B through C are designed to stand independently of it.</w:t>
+        <w:t>Participants complete a TOPIK-aligned pre-test, six weeks of practice, an immediate post-test, and a delayed retention test four weeks later. The primary outcome is normalised learning gain on the post-test; secondary outcomes are retention, items-to-mastery, per-skill diagnostic accuracy against instructor judgement, and completion rate. We note plainly that a sample of 60 per arm gives 80% power to detect a standardised between-arm difference of only d = 0.51 two-sided, or d = 0.59 Bonferroni-corrected across the three pairwise comparisons — larger than the 0.28–0.33 range reported for LLM feedback alone [27]. This is a known limitation of the pilot, not of the paper's technical claims, which is exactly why Subsections B through C are designed to stand independently of it.</w:t>
       </w:r>
     </w:p>
     <w:p>
@@ -2884,7 +2884,7 @@
           <w:color w:val="000000"/>
           <w:sz w:val="16"/>
         </w:rPr>
-        <w:t xml:space="preserve">S.-H. Hong and S. C. Yang, “Enhancing Korean as a foreign language learning through a mobile-assisted blended course: A triarchic and motivational perspective,” </w:t>
+        <w:t xml:space="preserve">R. Godwin-Jones, “Distributed agency in second language learning and teaching through generative AI,” </w:t>
       </w:r>
       <w:r>
         <w:rPr>
@@ -2894,7 +2894,7 @@
           <w:color w:val="000000"/>
           <w:sz w:val="16"/>
         </w:rPr>
-        <w:t>Language Teaching Research</w:t>
+        <w:t>Language Learning &amp; Technology</w:t>
       </w:r>
       <w:r>
         <w:rPr>
@@ -2904,7 +2904,7 @@
           <w:color w:val="000000"/>
           <w:sz w:val="16"/>
         </w:rPr>
-        <w:t>, Sep. 2025, doi: 10.1177/13621688251368643.</w:t>
+        <w:t>, vol. 28, no. 2, pp. 5–31, Jun. 2024, doi: 10.64152/10125/73570.</w:t>
       </w:r>
     </w:p>
     <w:p>
@@ -2933,7 +2933,7 @@
           <w:color w:val="000000"/>
           <w:sz w:val="16"/>
         </w:rPr>
-        <w:t xml:space="preserve">R. Godwin-Jones, “Distributed agency in second language learning and teaching through generative AI,” </w:t>
+        <w:t xml:space="preserve">H. W. Awalurahman, R. F. Aji, and I. Budi, “Transformer and large language models for automatic multiple-choice question generation: A systematic literature review,” </w:t>
       </w:r>
       <w:r>
         <w:rPr>
@@ -2943,7 +2943,7 @@
           <w:color w:val="000000"/>
           <w:sz w:val="16"/>
         </w:rPr>
-        <w:t>Language Learning &amp; Technology</w:t>
+        <w:t>IEEE Access</w:t>
       </w:r>
       <w:r>
         <w:rPr>
@@ -2953,7 +2953,7 @@
           <w:color w:val="000000"/>
           <w:sz w:val="16"/>
         </w:rPr>
-        <w:t>, vol. 28, no. 2, pp. 5–31, Jun. 2024, doi: 10.64152/10125/73570.</w:t>
+        <w:t>, vol. 13, pp. 127100–127112, 2025, doi: 10.1109/ACCESS.2025.3590423.</w:t>
       </w:r>
     </w:p>
     <w:p>
@@ -2982,7 +2982,7 @@
           <w:color w:val="000000"/>
           <w:sz w:val="16"/>
         </w:rPr>
-        <w:t xml:space="preserve">T.-Y. Tai and H. H.-J. Chen, “Impact of generative AI chatbots and interaction modes on the speaking proficiency of adolescent EFL learners,” </w:t>
+        <w:t xml:space="preserve">R. Oliveira, A. Hernández, M. Garbin, J. Dos Reis, and R. Azevedo, “Automatic question generation with large language models: A survey,” </w:t>
       </w:r>
       <w:r>
         <w:rPr>
@@ -2992,7 +2992,7 @@
           <w:color w:val="000000"/>
           <w:sz w:val="16"/>
         </w:rPr>
-        <w:t>Computer Assisted Language Learning</w:t>
+        <w:t>ACM Computing Surveys</w:t>
       </w:r>
       <w:r>
         <w:rPr>
@@ -3002,7 +3002,7 @@
           <w:color w:val="000000"/>
           <w:sz w:val="16"/>
         </w:rPr>
-        <w:t>, pp. 1–30, Oct. 2025, doi: 10.1080/09588221.2025.2572999.</w:t>
+        <w:t>, vol. 58, no. 15, pp. 1–34, Nov. 2026, doi: 10.1145/3832773.</w:t>
       </w:r>
     </w:p>
     <w:p>
@@ -3031,7 +3031,7 @@
           <w:color w:val="000000"/>
           <w:sz w:val="16"/>
         </w:rPr>
-        <w:t xml:space="preserve">S. Rashid, S. Malik, and F. Ghauri, “Ethically integrated generative AI for reading and vocabulary development in higher education: An experimental study of efficacy and learner perceptions,” </w:t>
+        <w:t xml:space="preserve">C. Badenes-Olmedo and P. Eyzaguirre, “QuerIA: Adaptive question generation and evaluation in higher education using large language models and contextual learning,” </w:t>
       </w:r>
       <w:r>
         <w:rPr>
@@ -3041,7 +3041,7 @@
           <w:color w:val="000000"/>
           <w:sz w:val="16"/>
         </w:rPr>
-        <w:t>Asian-Pacific Journal of Second and Foreign Language Education</w:t>
+        <w:t>Expert Systems with Applications</w:t>
       </w:r>
       <w:r>
         <w:rPr>
@@ -3051,7 +3051,7 @@
           <w:color w:val="000000"/>
           <w:sz w:val="16"/>
         </w:rPr>
-        <w:t>, vol. 11, no. 1, Sep. 2026, doi: 10.1186/s40862-026-00451-3.</w:t>
+        <w:t>, vol. 301, p. 130140, Mar. 2026, doi: 10.1016/j.eswa.2025.130140.</w:t>
       </w:r>
     </w:p>
     <w:p>
@@ -3080,7 +3080,7 @@
           <w:color w:val="000000"/>
           <w:sz w:val="16"/>
         </w:rPr>
-        <w:t xml:space="preserve">H. W. Awalurahman, R. F. Aji, and I. Budi, “Transformer and large language models for automatic multiple-choice question generation: A systematic literature review,” </w:t>
+        <w:t xml:space="preserve">X. Dong and Z. Li, “Efficient unified framework for difficulty-controllable question generation: Large language models enabling active learning labeling and prompt-based low-rank adaptation,” </w:t>
       </w:r>
       <w:r>
         <w:rPr>
@@ -3100,7 +3100,7 @@
           <w:color w:val="000000"/>
           <w:sz w:val="16"/>
         </w:rPr>
-        <w:t>, vol. 13, pp. 127100–127112, 2025, doi: 10.1109/ACCESS.2025.3590423.</w:t>
+        <w:t>, vol. 14, pp. 76358–76371, 2026, doi: 10.1109/ACCESS.2026.3693277.</w:t>
       </w:r>
     </w:p>
     <w:p>
@@ -3129,7 +3129,7 @@
           <w:color w:val="000000"/>
           <w:sz w:val="16"/>
         </w:rPr>
-        <w:t xml:space="preserve">R. Oliveira, A. Hernández, M. Garbin, J. Dos Reis, and R. Azevedo, “Automatic question generation with large language models: A survey,” </w:t>
+        <w:t xml:space="preserve">S. K. Bitew, J. Deleu, C. Develder, and T. Demeester, “Distractor generation for multiple-choice questions with predictive prompting and large language models,” in </w:t>
       </w:r>
       <w:r>
         <w:rPr>
@@ -3139,7 +3139,7 @@
           <w:color w:val="000000"/>
           <w:sz w:val="16"/>
         </w:rPr>
-        <w:t>ACM Computing Surveys</w:t>
+        <w:t>Communications in Computer and Information Science</w:t>
       </w:r>
       <w:r>
         <w:rPr>
@@ -3149,7 +3149,7 @@
           <w:color w:val="000000"/>
           <w:sz w:val="16"/>
         </w:rPr>
-        <w:t>, vol. 58, no. 15, pp. 1–34, Nov. 2026, doi: 10.1145/3832773.</w:t>
+        <w:t>, Cham, Switzerland: Springer, 2025, pp. 48–63, doi: 10.1007/978-3-031-74627-7_4.</w:t>
       </w:r>
     </w:p>
     <w:p>
@@ -3178,7 +3178,7 @@
           <w:color w:val="000000"/>
           <w:sz w:val="16"/>
         </w:rPr>
-        <w:t xml:space="preserve">J. Ling and M. Afzaal, “Automatic question-answer pairs generation using pre-trained large language models in higher education,” </w:t>
+        <w:t xml:space="preserve">M. Li, H. Jiao, T. Zhou, N. Zhang, S. Peters, and R. W. Lissitz, “Item difficulty modeling using fine-tuned small and large language models,” </w:t>
       </w:r>
       <w:r>
         <w:rPr>
@@ -3188,7 +3188,7 @@
           <w:color w:val="000000"/>
           <w:sz w:val="16"/>
         </w:rPr>
-        <w:t>Computers and Education: Artificial Intelligence</w:t>
+        <w:t>Educational and Psychological Measurement</w:t>
       </w:r>
       <w:r>
         <w:rPr>
@@ -3198,7 +3198,7 @@
           <w:color w:val="000000"/>
           <w:sz w:val="16"/>
         </w:rPr>
-        <w:t>, vol. 6, p. 100252, Jun. 2024, doi: 10.1016/j.caeai.2024.100252.</w:t>
+        <w:t>, vol. 85, no. 6, pp. 1065–1090, Dec. 2025, doi: 10.1177/00131644251344973.</w:t>
       </w:r>
     </w:p>
     <w:p>
@@ -3227,7 +3227,7 @@
           <w:color w:val="000000"/>
           <w:sz w:val="16"/>
         </w:rPr>
-        <w:t xml:space="preserve">C. Badenes-Olmedo and P. Eyzaguirre, “QuerIA: Adaptive question generation and evaluation in higher education using large language models and contextual learning,” </w:t>
+        <w:t xml:space="preserve">Y. Liu, S. Bhandari, and Z. A. Pardos, “Leveraging LLM respondents for item evaluation: A psychometric analysis,” </w:t>
       </w:r>
       <w:r>
         <w:rPr>
@@ -3237,7 +3237,7 @@
           <w:color w:val="000000"/>
           <w:sz w:val="16"/>
         </w:rPr>
-        <w:t>Expert Systems with Applications</w:t>
+        <w:t>British Journal of Educational Technology</w:t>
       </w:r>
       <w:r>
         <w:rPr>
@@ -3247,7 +3247,7 @@
           <w:color w:val="000000"/>
           <w:sz w:val="16"/>
         </w:rPr>
-        <w:t>, vol. 301, p. 130140, Mar. 2026, doi: 10.1016/j.eswa.2025.130140.</w:t>
+        <w:t>, vol. 56, no. 3, pp. 1028–1052, May 2025, doi: 10.1111/bjet.13570.</w:t>
       </w:r>
     </w:p>
     <w:p>
@@ -3276,7 +3276,7 @@
           <w:color w:val="000000"/>
           <w:sz w:val="16"/>
         </w:rPr>
-        <w:t xml:space="preserve">X. Dong and Z. Li, “Efficient unified framework for difficulty-controllable question generation: Large language models enabling active learning labeling and prompt-based low-rank adaptation,” </w:t>
+        <w:t xml:space="preserve">Y. Gao, Y. Ma, Y. Qi, and T. Liu, “Development of a computerized adaptive item bank for the Big Five personality based on large language models,” </w:t>
       </w:r>
       <w:r>
         <w:rPr>
@@ -3286,7 +3286,7 @@
           <w:color w:val="000000"/>
           <w:sz w:val="16"/>
         </w:rPr>
-        <w:t>IEEE Access</w:t>
+        <w:t>Assessment</w:t>
       </w:r>
       <w:r>
         <w:rPr>
@@ -3296,7 +3296,7 @@
           <w:color w:val="000000"/>
           <w:sz w:val="16"/>
         </w:rPr>
-        <w:t>, vol. 14, pp. 76358–76371, 2026, doi: 10.1109/ACCESS.2026.3693277.</w:t>
+        <w:t>, Mar. 2026, doi: 10.1177/10731911261427877.</w:t>
       </w:r>
     </w:p>
     <w:p>
@@ -3325,7 +3325,7 @@
           <w:color w:val="000000"/>
           <w:sz w:val="16"/>
         </w:rPr>
-        <w:t xml:space="preserve">S. K. Bitew, J. Deleu, C. Develder, and T. Demeester, “Distractor generation for multiple-choice questions with predictive prompting and large language models,” in </w:t>
+        <w:t xml:space="preserve">K. Li, C. Qian, and X. Yang, “Evaluating the quality of student-generated content in learnersourcing: A large language model based approach,” </w:t>
       </w:r>
       <w:r>
         <w:rPr>
@@ -3335,7 +3335,7 @@
           <w:color w:val="000000"/>
           <w:sz w:val="16"/>
         </w:rPr>
-        <w:t>Communications in Computer and Information Science</w:t>
+        <w:t>Education and Information Technologies</w:t>
       </w:r>
       <w:r>
         <w:rPr>
@@ -3345,7 +3345,7 @@
           <w:color w:val="000000"/>
           <w:sz w:val="16"/>
         </w:rPr>
-        <w:t>, Cham, Switzerland: Springer, 2025, pp. 48–63, doi: 10.1007/978-3-031-74627-7_4.</w:t>
+        <w:t>, vol. 30, no. 2, pp. 2331–2360, Feb. 2025, doi: 10.1007/s10639-024-12851-4.</w:t>
       </w:r>
     </w:p>
     <w:p>
@@ -3374,7 +3374,7 @@
           <w:color w:val="000000"/>
           <w:sz w:val="16"/>
         </w:rPr>
-        <w:t xml:space="preserve">M. Li, H. Jiao, T. Zhou, N. Zhang, S. Peters, and R. W. Lissitz, “Item difficulty modeling using fine-tuned small and large language models,” </w:t>
+        <w:t xml:space="preserve">M. Bolsinova, B. Gergely, and M. J. S. Brinkhuis, “Keeping Elo alive: Evaluating and improving measurement properties of learning systems based on Elo ratings,” </w:t>
       </w:r>
       <w:r>
         <w:rPr>
@@ -3384,7 +3384,7 @@
           <w:color w:val="000000"/>
           <w:sz w:val="16"/>
         </w:rPr>
-        <w:t>Educational and Psychological Measurement</w:t>
+        <w:t>British Journal of Mathematical and Statistical Psychology</w:t>
       </w:r>
       <w:r>
         <w:rPr>
@@ -3394,7 +3394,7 @@
           <w:color w:val="000000"/>
           <w:sz w:val="16"/>
         </w:rPr>
-        <w:t>, vol. 85, no. 6, pp. 1065–1090, Dec. 2025, doi: 10.1177/00131644251344973.</w:t>
+        <w:t>, vol. 79, no. 1, pp. 95–110, Feb. 2026, doi: 10.1111/bmsp.12395.</w:t>
       </w:r>
     </w:p>
     <w:p>
@@ -3423,7 +3423,7 @@
           <w:color w:val="000000"/>
           <w:sz w:val="16"/>
         </w:rPr>
-        <w:t xml:space="preserve">Y. Liu, S. Bhandari, and Z. A. Pardos, “Leveraging LLM respondents for item evaluation: A psychometric analysis,” </w:t>
+        <w:t xml:space="preserve">M. Bolsinova, M. J. S. Brinkhuis, A. D. Hofman, and G. Maris, “Tracking a multitude of abilities as they develop,” </w:t>
       </w:r>
       <w:r>
         <w:rPr>
@@ -3433,7 +3433,7 @@
           <w:color w:val="000000"/>
           <w:sz w:val="16"/>
         </w:rPr>
-        <w:t>British Journal of Educational Technology</w:t>
+        <w:t>British Journal of Mathematical and Statistical Psychology</w:t>
       </w:r>
       <w:r>
         <w:rPr>
@@ -3443,7 +3443,7 @@
           <w:color w:val="000000"/>
           <w:sz w:val="16"/>
         </w:rPr>
-        <w:t>, vol. 56, no. 3, pp. 1028–1052, May 2025, doi: 10.1111/bjet.13570.</w:t>
+        <w:t>, vol. 75, no. 3, pp. 753–778, Nov. 2022, doi: 10.1111/bmsp.12276.</w:t>
       </w:r>
     </w:p>
     <w:p>
@@ -3472,7 +3472,7 @@
           <w:color w:val="000000"/>
           <w:sz w:val="16"/>
         </w:rPr>
-        <w:t xml:space="preserve">Y. Gao, Y. Ma, Y. Qi, and T. Liu, “Development of a computerized adaptive item bank for the Big Five personality based on large language models,” </w:t>
+        <w:t xml:space="preserve">B. Gergely and M. Bolsinova, “Toward psychometric learning analytics: Augmenting the Urnings algorithm with response times,” </w:t>
       </w:r>
       <w:r>
         <w:rPr>
@@ -3482,7 +3482,7 @@
           <w:color w:val="000000"/>
           <w:sz w:val="16"/>
         </w:rPr>
-        <w:t>Assessment</w:t>
+        <w:t>Journal of Educational Measurement</w:t>
       </w:r>
       <w:r>
         <w:rPr>
@@ -3492,7 +3492,7 @@
           <w:color w:val="000000"/>
           <w:sz w:val="16"/>
         </w:rPr>
-        <w:t>, Mar. 2026, doi: 10.1177/10731911261427877.</w:t>
+        <w:t>, vol. 63, no. 1, Mar. 2026, doi: 10.1111/jedm.70026.</w:t>
       </w:r>
     </w:p>
     <w:p>
@@ -3521,7 +3521,7 @@
           <w:color w:val="000000"/>
           <w:sz w:val="16"/>
         </w:rPr>
-        <w:t xml:space="preserve">K. Li, C. Qian, and X. Yang, “Evaluating the quality of student-generated content in learnersourcing: A large language model based approach,” </w:t>
+        <w:t xml:space="preserve">H. Vermeiren, J. Kruis, M. Bolsinova, H. L. J. van der Maas, and A. D. Hofman, “Psychometrics of an Elo-based large-scale online learning system,” </w:t>
       </w:r>
       <w:r>
         <w:rPr>
@@ -3531,7 +3531,7 @@
           <w:color w:val="000000"/>
           <w:sz w:val="16"/>
         </w:rPr>
-        <w:t>Education and Information Technologies</w:t>
+        <w:t>Computers and Education: Artificial Intelligence</w:t>
       </w:r>
       <w:r>
         <w:rPr>
@@ -3541,7 +3541,7 @@
           <w:color w:val="000000"/>
           <w:sz w:val="16"/>
         </w:rPr>
-        <w:t>, vol. 30, no. 2, pp. 2331–2360, Feb. 2025, doi: 10.1007/s10639-024-12851-4.</w:t>
+        <w:t>, vol. 8, p. 100376, Jun. 2025, doi: 10.1016/j.caeai.2025.100376.</w:t>
       </w:r>
     </w:p>
     <w:p>
@@ -3570,7 +3570,7 @@
           <w:color w:val="000000"/>
           <w:sz w:val="16"/>
         </w:rPr>
-        <w:t xml:space="preserve">M. Bolsinova, B. Gergely, and M. J. S. Brinkhuis, “Keeping Elo alive: Evaluating and improving measurement properties of learning systems based on Elo ratings,” </w:t>
+        <w:t xml:space="preserve">H. Vermeiren, A. D. Hofman, M. Bolsinova, H. L. J. van der Maas, and W. Van Den Noortgate, “Balancing stability and flexibility: Investigating a dynamic K value approach for the Elo rating system in adaptive learning environments,” </w:t>
       </w:r>
       <w:r>
         <w:rPr>
@@ -3580,7 +3580,7 @@
           <w:color w:val="000000"/>
           <w:sz w:val="16"/>
         </w:rPr>
-        <w:t>British Journal of Mathematical and Statistical Psychology</w:t>
+        <w:t>User Modeling and User-Adapted Interaction</w:t>
       </w:r>
       <w:r>
         <w:rPr>
@@ -3590,7 +3590,7 @@
           <w:color w:val="000000"/>
           <w:sz w:val="16"/>
         </w:rPr>
-        <w:t>, vol. 79, no. 1, pp. 95–110, Feb. 2026, doi: 10.1111/bmsp.12395.</w:t>
+        <w:t>, vol. 36, no. 1, Art. 4, Dec. 2025, doi: 10.1007/s11257-025-09439-z.</w:t>
       </w:r>
     </w:p>
     <w:p>
@@ -3619,7 +3619,7 @@
           <w:color w:val="000000"/>
           <w:sz w:val="16"/>
         </w:rPr>
-        <w:t xml:space="preserve">M. Bolsinova, M. J. S. Brinkhuis, A. D. Hofman, and G. Maris, “Tracking a multitude of abilities as they develop,” </w:t>
+        <w:t xml:space="preserve">B. Vesin, K. Mangaroska, K. Akhuseyinoglu, and M. Giannakos, “Adaptive assessment and content recommendation in online programming courses: On the use of Elo-rating,” </w:t>
       </w:r>
       <w:r>
         <w:rPr>
@@ -3629,7 +3629,7 @@
           <w:color w:val="000000"/>
           <w:sz w:val="16"/>
         </w:rPr>
-        <w:t>British Journal of Mathematical and Statistical Psychology</w:t>
+        <w:t>ACM Transactions on Computing Education</w:t>
       </w:r>
       <w:r>
         <w:rPr>
@@ -3639,7 +3639,7 @@
           <w:color w:val="000000"/>
           <w:sz w:val="16"/>
         </w:rPr>
-        <w:t>, vol. 75, no. 3, pp. 753–778, Nov. 2022, doi: 10.1111/bmsp.12276.</w:t>
+        <w:t>, vol. 22, no. 3, pp. 1–27, Sep. 2022, doi: 10.1145/3511886.</w:t>
       </w:r>
     </w:p>
     <w:p>
@@ -3668,7 +3668,7 @@
           <w:color w:val="000000"/>
           <w:sz w:val="16"/>
         </w:rPr>
-        <w:t xml:space="preserve">B. Gergely and M. Bolsinova, “Toward psychometric learning analytics: Augmenting the Urnings algorithm with response times,” </w:t>
+        <w:t xml:space="preserve">C. Tong and C. Ren, “Deep knowledge tracing and cognitive load estimation for personalized learning path generation using neural network architecture,” </w:t>
       </w:r>
       <w:r>
         <w:rPr>
@@ -3678,7 +3678,7 @@
           <w:color w:val="000000"/>
           <w:sz w:val="16"/>
         </w:rPr>
-        <w:t>Journal of Educational Measurement</w:t>
+        <w:t>Scientific Reports</w:t>
       </w:r>
       <w:r>
         <w:rPr>
@@ -3688,7 +3688,7 @@
           <w:color w:val="000000"/>
           <w:sz w:val="16"/>
         </w:rPr>
-        <w:t>, vol. 63, no. 1, Mar. 2026, doi: 10.1111/jedm.70026.</w:t>
+        <w:t>, vol. 15, no. 1, Jul. 2025, doi: 10.1038/s41598-025-10497-x.</w:t>
       </w:r>
     </w:p>
     <w:p>
@@ -3717,7 +3717,7 @@
           <w:color w:val="000000"/>
           <w:sz w:val="16"/>
         </w:rPr>
-        <w:t xml:space="preserve">B. Vesin, K. Mangaroska, K. Akhuseyinoglu, and M. Giannakos, “Adaptive assessment and content recommendation in online programming courses: On the use of Elo-rating,” </w:t>
+        <w:t xml:space="preserve">X. Jiang, B. Yang, and W. Liu, “DMAM: Difficulty-enhanced multi-view attention-based model for knowledge tracing,” </w:t>
       </w:r>
       <w:r>
         <w:rPr>
@@ -3727,7 +3727,7 @@
           <w:color w:val="000000"/>
           <w:sz w:val="16"/>
         </w:rPr>
-        <w:t>ACM Transactions on Computing Education</w:t>
+        <w:t>Knowledge-Based Systems</w:t>
       </w:r>
       <w:r>
         <w:rPr>
@@ -3737,7 +3737,7 @@
           <w:color w:val="000000"/>
           <w:sz w:val="16"/>
         </w:rPr>
-        <w:t>, vol. 22, no. 3, pp. 1–27, Sep. 2022, doi: 10.1145/3511886.</w:t>
+        <w:t>, vol. 324, p. 113736, Aug. 2025, doi: 10.1016/j.knosys.2025.113736.</w:t>
       </w:r>
     </w:p>
     <w:p>
@@ -3766,7 +3766,7 @@
           <w:color w:val="000000"/>
           <w:sz w:val="16"/>
         </w:rPr>
-        <w:t xml:space="preserve">C. Tong and C. Ren, “Deep knowledge tracing and cognitive load estimation for personalized learning path generation using neural network architecture,” </w:t>
+        <w:t xml:space="preserve">L. Qian, K. Zheng, L. Wang, and S. Li, “Student state-aware knowledge tracing based on attention mechanism: A cognitive theory view,” </w:t>
       </w:r>
       <w:r>
         <w:rPr>
@@ -3776,7 +3776,7 @@
           <w:color w:val="000000"/>
           <w:sz w:val="16"/>
         </w:rPr>
-        <w:t>Scientific Reports</w:t>
+        <w:t>Pattern Recognition Letters</w:t>
       </w:r>
       <w:r>
         <w:rPr>
@@ -3786,7 +3786,7 @@
           <w:color w:val="000000"/>
           <w:sz w:val="16"/>
         </w:rPr>
-        <w:t>, vol. 15, no. 1, Jul. 2025, doi: 10.1038/s41598-025-10497-x.</w:t>
+        <w:t>, vol. 184, pp. 190–196, Aug. 2024, doi: 10.1016/j.patrec.2024.06.009.</w:t>
       </w:r>
     </w:p>
     <w:p>
@@ -3815,7 +3815,7 @@
           <w:color w:val="000000"/>
           <w:sz w:val="16"/>
         </w:rPr>
-        <w:t xml:space="preserve">X. Jiang, B. Yang, and W. Liu, “DMAM: Difficulty-enhanced multi-view attention-based model for knowledge tracing,” </w:t>
+        <w:t xml:space="preserve">F. Wang, Q. Liu, E. Chen, Z. Huang, Y. Yin, S. Wang, and Y. Su, “NeuralCD: A general framework for cognitive diagnosis,” </w:t>
       </w:r>
       <w:r>
         <w:rPr>
@@ -3825,7 +3825,7 @@
           <w:color w:val="000000"/>
           <w:sz w:val="16"/>
         </w:rPr>
-        <w:t>Knowledge-Based Systems</w:t>
+        <w:t>IEEE Transactions on Knowledge and Data Engineering</w:t>
       </w:r>
       <w:r>
         <w:rPr>
@@ -3835,7 +3835,7 @@
           <w:color w:val="000000"/>
           <w:sz w:val="16"/>
         </w:rPr>
-        <w:t>, vol. 324, p. 113736, Aug. 2025, doi: 10.1016/j.knosys.2025.113736.</w:t>
+        <w:t>, vol. 35, no. 8, pp. 8312–8327, Aug. 2023, doi: 10.1109/TKDE.2022.3201037.</w:t>
       </w:r>
     </w:p>
     <w:p>
@@ -3864,7 +3864,7 @@
           <w:color w:val="000000"/>
           <w:sz w:val="16"/>
         </w:rPr>
-        <w:t xml:space="preserve">L. Qian, K. Zheng, L. Wang, and S. Li, “Student state-aware knowledge tracing based on attention mechanism: A cognitive theory view,” </w:t>
+        <w:t xml:space="preserve">T. Huang, J. Geng, H. Yang, S. Hu, X. Ou, J. Hu, and Z. Yang, “Interpretable neuro-cognitive diagnostic approach incorporating multidimensional features,” </w:t>
       </w:r>
       <w:r>
         <w:rPr>
@@ -3874,7 +3874,7 @@
           <w:color w:val="000000"/>
           <w:sz w:val="16"/>
         </w:rPr>
-        <w:t>Pattern Recognition Letters</w:t>
+        <w:t>Knowledge-Based Systems</w:t>
       </w:r>
       <w:r>
         <w:rPr>
@@ -3884,7 +3884,7 @@
           <w:color w:val="000000"/>
           <w:sz w:val="16"/>
         </w:rPr>
-        <w:t>, vol. 184, pp. 190–196, Aug. 2024, doi: 10.1016/j.patrec.2024.06.009.</w:t>
+        <w:t>, vol. 304, p. 112432, Nov. 2024, doi: 10.1016/j.knosys.2024.112432.</w:t>
       </w:r>
     </w:p>
     <w:p>
@@ -3913,7 +3913,7 @@
           <w:color w:val="000000"/>
           <w:sz w:val="16"/>
         </w:rPr>
-        <w:t xml:space="preserve">F. Wang, Q. Liu, E. Chen, Z. Huang, Y. Yin, S. Wang, and Y. Su, “NeuralCD: A general framework for cognitive diagnosis,” </w:t>
+        <w:t xml:space="preserve">J. Song, K. Lim, and J. Park, “Enriching the Korean learner corpus for grammatical error correction and writing assessment,” </w:t>
       </w:r>
       <w:r>
         <w:rPr>
@@ -3923,7 +3923,7 @@
           <w:color w:val="000000"/>
           <w:sz w:val="16"/>
         </w:rPr>
-        <w:t>IEEE Transactions on Knowledge and Data Engineering</w:t>
+        <w:t>Language Resources and Evaluation</w:t>
       </w:r>
       <w:r>
         <w:rPr>
@@ -3933,7 +3933,7 @@
           <w:color w:val="000000"/>
           <w:sz w:val="16"/>
         </w:rPr>
-        <w:t>, vol. 35, no. 8, pp. 8312–8327, Aug. 2023, doi: 10.1109/TKDE.2022.3201037.</w:t>
+        <w:t>, vol. 60, no. 1, Mar. 2026, doi: 10.1007/s10579-025-09882-9.</w:t>
       </w:r>
     </w:p>
     <w:p>
@@ -3962,7 +3962,7 @@
           <w:color w:val="000000"/>
           <w:sz w:val="16"/>
         </w:rPr>
-        <w:t xml:space="preserve">T. Huang, J. Geng, H. Yang, S. Hu, X. Ou, J. Hu, and Z. Yang, “Interpretable neuro-cognitive diagnostic approach incorporating multidimensional features,” </w:t>
+        <w:t xml:space="preserve">J. Chun and M. H. Kim, “Corpus-informed application based on Korean Learners’ Corpus: Substitution errors of topic and nominative markers,” </w:t>
       </w:r>
       <w:r>
         <w:rPr>
@@ -3972,7 +3972,7 @@
           <w:color w:val="000000"/>
           <w:sz w:val="16"/>
         </w:rPr>
-        <w:t>Knowledge-Based Systems</w:t>
+        <w:t>Asian-Pacific Journal of Second and Foreign Language Education</w:t>
       </w:r>
       <w:r>
         <w:rPr>
@@ -3982,7 +3982,7 @@
           <w:color w:val="000000"/>
           <w:sz w:val="16"/>
         </w:rPr>
-        <w:t>, vol. 304, p. 112432, Nov. 2024, doi: 10.1016/j.knosys.2024.112432.</w:t>
+        <w:t>, vol. 6, no. 1, Dec. 2021, doi: 10.1186/s40862-021-00112-7.</w:t>
       </w:r>
     </w:p>
     <w:p>
@@ -4011,7 +4011,7 @@
           <w:color w:val="000000"/>
           <w:sz w:val="16"/>
         </w:rPr>
-        <w:t xml:space="preserve">J. Song, K. Lim, and J. Park, “Enriching the Korean learner corpus for grammatical error correction and writing assessment,” </w:t>
+        <w:t xml:space="preserve">H. Yu, Y. Cho, G. Park, and M. Kim, “KRongBERT: Enhanced factorization-based morphological approach for the Korean pretrained language model,” </w:t>
       </w:r>
       <w:r>
         <w:rPr>
@@ -4021,7 +4021,7 @@
           <w:color w:val="000000"/>
           <w:sz w:val="16"/>
         </w:rPr>
-        <w:t>Language Resources and Evaluation</w:t>
+        <w:t>Information Processing &amp; Management</w:t>
       </w:r>
       <w:r>
         <w:rPr>
@@ -4031,7 +4031,7 @@
           <w:color w:val="000000"/>
           <w:sz w:val="16"/>
         </w:rPr>
-        <w:t>, vol. 60, no. 1, Mar. 2026, doi: 10.1007/s10579-025-09882-9.</w:t>
+        <w:t>, vol. 62, no. 3, p. 104072, May 2025, doi: 10.1016/j.ipm.2025.104072.</w:t>
       </w:r>
     </w:p>
     <w:p>
@@ -4060,7 +4060,7 @@
           <w:color w:val="000000"/>
           <w:sz w:val="16"/>
         </w:rPr>
-        <w:t xml:space="preserve">J. Chun and M. H. Kim, “Corpus-informed application based on Korean Learners’ Corpus: Substitution errors of topic and nominative markers,” </w:t>
+        <w:t xml:space="preserve">R. C. Wilson, A. Shenhav, M. Straccia, and J. D. Cohen, “The eighty five percent rule for optimal learning,” </w:t>
       </w:r>
       <w:r>
         <w:rPr>
@@ -4070,7 +4070,7 @@
           <w:color w:val="000000"/>
           <w:sz w:val="16"/>
         </w:rPr>
-        <w:t>Asian-Pacific Journal of Second and Foreign Language Education</w:t>
+        <w:t>Nature Communications</w:t>
       </w:r>
       <w:r>
         <w:rPr>
@@ -4080,7 +4080,7 @@
           <w:color w:val="000000"/>
           <w:sz w:val="16"/>
         </w:rPr>
-        <w:t>, vol. 6, no. 1, Dec. 2021, doi: 10.1186/s40862-021-00112-7.</w:t>
+        <w:t>, vol. 10, no. 1, Nov. 2019, doi: 10.1038/s41467-019-12552-4.</w:t>
       </w:r>
     </w:p>
     <w:p>
@@ -4109,7 +4109,7 @@
           <w:color w:val="000000"/>
           <w:sz w:val="16"/>
         </w:rPr>
-        <w:t xml:space="preserve">H. Yu, Y. Cho, G. Park, and M. Kim, “KRongBERT: Enhanced factorization-based morphological approach for the Korean pretrained language model,” </w:t>
+        <w:t xml:space="preserve">B. Settles and B. Meeder, “A trainable spaced repetition model for language learning,” in </w:t>
       </w:r>
       <w:r>
         <w:rPr>
@@ -4119,7 +4119,7 @@
           <w:color w:val="000000"/>
           <w:sz w:val="16"/>
         </w:rPr>
-        <w:t>Information Processing &amp; Management</w:t>
+        <w:t>Proc. 54th Annu. Meeting Assoc. Comput. Linguistics (ACL)</w:t>
       </w:r>
       <w:r>
         <w:rPr>
@@ -4129,7 +4129,7 @@
           <w:color w:val="000000"/>
           <w:sz w:val="16"/>
         </w:rPr>
-        <w:t>, vol. 62, no. 3, p. 104072, May 2025, doi: 10.1016/j.ipm.2025.104072.</w:t>
+        <w:t>, Berlin, Germany, 2016, pp. 1848–1858, doi: 10.18653/v1/P16-1174.</w:t>
       </w:r>
     </w:p>
     <w:p>
@@ -4158,7 +4158,7 @@
           <w:color w:val="000000"/>
           <w:sz w:val="16"/>
         </w:rPr>
-        <w:t xml:space="preserve">R. C. Wilson, A. Shenhav, M. Straccia, and J. D. Cohen, “The eighty five percent rule for optimal learning,” </w:t>
+        <w:t xml:space="preserve">D. R. Thomas, C. Borchers, S. Bhushan, E. Gatz, S. Gupta, and K. R. Koedinger, “LLM-generated feedback supports learning if learners choose to use it,” in </w:t>
       </w:r>
       <w:r>
         <w:rPr>
@@ -4168,7 +4168,7 @@
           <w:color w:val="000000"/>
           <w:sz w:val="16"/>
         </w:rPr>
-        <w:t>Nature Communications</w:t>
+        <w:t>Lecture Notes in Computer Science</w:t>
       </w:r>
       <w:r>
         <w:rPr>
@@ -4178,7 +4178,7 @@
           <w:color w:val="000000"/>
           <w:sz w:val="16"/>
         </w:rPr>
-        <w:t>, vol. 10, no. 1, Nov. 2019, doi: 10.1038/s41467-019-12552-4.</w:t>
+        <w:t>, vol. 16063, Cham, Switzerland: Springer, 2026, doi: 10.1007/978-3-032-03870-8_33.</w:t>
       </w:r>
     </w:p>
     <w:p>
@@ -4207,7 +4207,7 @@
           <w:color w:val="000000"/>
           <w:sz w:val="16"/>
         </w:rPr>
-        <w:t xml:space="preserve">B. Settles and B. Meeder, “A trainable spaced repetition model for language learning,” in </w:t>
+        <w:t xml:space="preserve">A. Pack, A. Barrett, and J. Escalante, “Large language models and automated essay scoring of English language learner writing: Insights into validity and reliability,” </w:t>
       </w:r>
       <w:r>
         <w:rPr>
@@ -4217,7 +4217,7 @@
           <w:color w:val="000000"/>
           <w:sz w:val="16"/>
         </w:rPr>
-        <w:t>Proc. 54th Annu. Meeting Assoc. Comput. Linguistics (ACL)</w:t>
+        <w:t>Computers and Education: Artificial Intelligence</w:t>
       </w:r>
       <w:r>
         <w:rPr>
@@ -4227,7 +4227,7 @@
           <w:color w:val="000000"/>
           <w:sz w:val="16"/>
         </w:rPr>
-        <w:t>, Berlin, Germany, 2016, pp. 1848–1858, doi: 10.18653/v1/P16-1174.</w:t>
+        <w:t>, vol. 6, p. 100234, Jun. 2024, doi: 10.1016/j.caeai.2024.100234.</w:t>
       </w:r>
     </w:p>
     <w:p>
@@ -4256,7 +4256,7 @@
           <w:color w:val="000000"/>
           <w:sz w:val="16"/>
         </w:rPr>
-        <w:t xml:space="preserve">D. R. Thomas, C. Borchers, S. Bhushan, E. Gatz, S. Gupta, and K. R. Koedinger, “LLM-generated feedback supports learning if learners choose to use it,” in </w:t>
+        <w:t xml:space="preserve">S. Crossley, L. Holmes, and W. Morris, “Assessing the reliability and validity of large language models in automatic essay scoring,” </w:t>
       </w:r>
       <w:r>
         <w:rPr>
@@ -4266,7 +4266,7 @@
           <w:color w:val="000000"/>
           <w:sz w:val="16"/>
         </w:rPr>
-        <w:t>Lecture Notes in Computer Science</w:t>
+        <w:t>Assessing Writing</w:t>
       </w:r>
       <w:r>
         <w:rPr>
@@ -4276,7 +4276,7 @@
           <w:color w:val="000000"/>
           <w:sz w:val="16"/>
         </w:rPr>
-        <w:t>, vol. 16063, Cham, Switzerland: Springer, 2026, doi: 10.1007/978-3-032-03870-8_33.</w:t>
+        <w:t>, vol. 69, p. 101082, Jul. 2026, doi: 10.1016/j.asw.2026.101082.</w:t>
       </w:r>
     </w:p>
     <w:p>
@@ -4305,7 +4305,7 @@
           <w:color w:val="000000"/>
           <w:sz w:val="16"/>
         </w:rPr>
-        <w:t xml:space="preserve">A. Pack, A. Barrett, and J. Escalante, “Large language models and automated essay scoring of English language learner writing: Insights into validity and reliability,” </w:t>
+        <w:t xml:space="preserve">F. Aydın and H. Yurdugül, “Tutoring model for intelligent tutoring systems: Adaptive instructional scaffoldings based on experiences of the learner digital twin,” </w:t>
       </w:r>
       <w:r>
         <w:rPr>
@@ -4315,7 +4315,7 @@
           <w:color w:val="000000"/>
           <w:sz w:val="16"/>
         </w:rPr>
-        <w:t>Computers and Education: Artificial Intelligence</w:t>
+        <w:t>Technology, Knowledge and Learning</w:t>
       </w:r>
       <w:r>
         <w:rPr>
@@ -4325,7 +4325,7 @@
           <w:color w:val="000000"/>
           <w:sz w:val="16"/>
         </w:rPr>
-        <w:t>, vol. 6, p. 100234, Jun. 2024, doi: 10.1016/j.caeai.2024.100234.</w:t>
+        <w:t>, Oct. 2026, doi: 10.1007/s10758-026-10039-y.</w:t>
       </w:r>
     </w:p>
     <w:p>
@@ -4354,7 +4354,7 @@
           <w:color w:val="000000"/>
           <w:sz w:val="16"/>
         </w:rPr>
-        <w:t xml:space="preserve">S. Crossley, L. Holmes, and W. Morris, “Assessing the reliability and validity of large language models in automatic essay scoring,” </w:t>
+        <w:t xml:space="preserve">B. Hu, Y. Ma, Z. Liu, and H. Wang, “A social importance and category enhanced cold-start user recommendation system,” </w:t>
       </w:r>
       <w:r>
         <w:rPr>
@@ -4364,7 +4364,7 @@
           <w:color w:val="000000"/>
           <w:sz w:val="16"/>
         </w:rPr>
-        <w:t>Assessing Writing</w:t>
+        <w:t>Expert Systems with Applications</w:t>
       </w:r>
       <w:r>
         <w:rPr>
@@ -4374,7 +4374,7 @@
           <w:color w:val="000000"/>
           <w:sz w:val="16"/>
         </w:rPr>
-        <w:t>, vol. 69, p. 101082, Jul. 2026, doi: 10.1016/j.asw.2026.101082.</w:t>
+        <w:t>, vol. 277, p. 127130, Jun. 2025, doi: 10.1016/j.eswa.2025.127130.</w:t>
       </w:r>
     </w:p>
     <w:p>
@@ -4403,27 +4403,7 @@
           <w:color w:val="000000"/>
           <w:sz w:val="16"/>
         </w:rPr>
-        <w:t xml:space="preserve">F. Aydın and H. Yurdugül, “Tutoring model for intelligent tutoring systems: Adaptive instructional scaffoldings based on experiences of the learner digital twin,” </w:t>
-      </w:r>
-      <w:r>
-        <w:rPr>
-          <w:rFonts w:ascii="Times New Roman" w:hAnsi="Times New Roman" w:eastAsia="Malgun Gothic"/>
-          <w:b w:val="0"/>
-          <w:i/>
-          <w:color w:val="000000"/>
-          <w:sz w:val="16"/>
-        </w:rPr>
-        <w:t>Technology, Knowledge and Learning</w:t>
-      </w:r>
-      <w:r>
-        <w:rPr>
-          <w:rFonts w:ascii="Times New Roman" w:hAnsi="Times New Roman" w:eastAsia="Malgun Gothic"/>
-          <w:b w:val="0"/>
-          <w:i w:val="0"/>
-          <w:color w:val="000000"/>
-          <w:sz w:val="16"/>
-        </w:rPr>
-        <w:t>, Oct. 2026, doi: 10.1007/s10758-026-10039-y.</w:t>
+        <w:t>LG AI Research, “EXAONE 4.0: Unified large language models integrating non-reasoning and reasoning modes,” LG AI Research, Seoul, South Korea, Tech. Rep., 2025.</w:t>
       </w:r>
     </w:p>
     <w:p>
@@ -4452,27 +4432,7 @@
           <w:color w:val="000000"/>
           <w:sz w:val="16"/>
         </w:rPr>
-        <w:t xml:space="preserve">B. Hu, Y. Ma, Z. Liu, and H. Wang, “A social importance and category enhanced cold-start user recommendation system,” </w:t>
-      </w:r>
-      <w:r>
-        <w:rPr>
-          <w:rFonts w:ascii="Times New Roman" w:hAnsi="Times New Roman" w:eastAsia="Malgun Gothic"/>
-          <w:b w:val="0"/>
-          <w:i/>
-          <w:color w:val="000000"/>
-          <w:sz w:val="16"/>
-        </w:rPr>
-        <w:t>Expert Systems with Applications</w:t>
-      </w:r>
-      <w:r>
-        <w:rPr>
-          <w:rFonts w:ascii="Times New Roman" w:hAnsi="Times New Roman" w:eastAsia="Malgun Gothic"/>
-          <w:b w:val="0"/>
-          <w:i w:val="0"/>
-          <w:color w:val="000000"/>
-          <w:sz w:val="16"/>
-        </w:rPr>
-        <w:t>, vol. 277, p. 127130, Jun. 2025, doi: 10.1016/j.eswa.2025.127130.</w:t>
+        <w:t>Qwen Team, “Qwen3 technical report,” Alibaba Group, Hangzhou, China, Tech. Rep., 2025.</w:t>
       </w:r>
     </w:p>
     <w:p>
@@ -4501,7 +4461,27 @@
           <w:color w:val="000000"/>
           <w:sz w:val="16"/>
         </w:rPr>
-        <w:t>LG AI Research, “EXAONE 4.0: Unified large language models integrating non-reasoning and reasoning modes,” LG AI Research, Seoul, South Korea, Tech. Rep., 2025.</w:t>
+        <w:t xml:space="preserve">S. Park, J. Moon, S. Kim, W. I. Cho, J. Han, J. Park, C. Song, J. Kim, Y. Song, T. Oh, J. Lee, J. Oh, S. Lyu, Y. Jeong, I. Lee, S. Seo, D. Lee, H. Kim, M. Lee, S. Jang, S. Do, S. Kim, K. Lim, J. Lee, K. Park, J. Shin, S. Kim, L. Park, A. Oh, J.-W. Ha, and K. Cho, “KLUE: Korean language understanding evaluation,” in </w:t>
+      </w:r>
+      <w:r>
+        <w:rPr>
+          <w:rFonts w:ascii="Times New Roman" w:hAnsi="Times New Roman" w:eastAsia="Malgun Gothic"/>
+          <w:b w:val="0"/>
+          <w:i/>
+          <w:color w:val="000000"/>
+          <w:sz w:val="16"/>
+        </w:rPr>
+        <w:t>Proc. 35th Conf. Neural Information Processing Systems (NeurIPS) Datasets and Benchmarks Track</w:t>
+      </w:r>
+      <w:r>
+        <w:rPr>
+          <w:rFonts w:ascii="Times New Roman" w:hAnsi="Times New Roman" w:eastAsia="Malgun Gothic"/>
+          <w:b w:val="0"/>
+          <w:i w:val="0"/>
+          <w:color w:val="000000"/>
+          <w:sz w:val="16"/>
+        </w:rPr>
+        <w:t>, 2021.</w:t>
       </w:r>
     </w:p>
     <w:p>
@@ -4530,7 +4510,7 @@
           <w:color w:val="000000"/>
           <w:sz w:val="16"/>
         </w:rPr>
-        <w:t>Qwen Team, “Qwen3 technical report,” Alibaba Group, Hangzhou, China, Tech. Rep., 2025.</w:t>
+        <w:t>Duolingo, Inc., “How Duolingo’s AI learns what you need to learn,” Duolingo Engineering Blog, 2023. [Online]. Available: https://blog.duolingo.com/duolingo-technology-innovations/. [Accessed: 18-Oct-2026].</w:t>
       </w:r>
     </w:p>
     <w:p>
@@ -4559,27 +4539,7 @@
           <w:color w:val="000000"/>
           <w:sz w:val="16"/>
         </w:rPr>
-        <w:t xml:space="preserve">S. Park, J. Moon, S. Kim, W. I. Cho, J. Han, J. Park, C. Song, J. Kim, Y. Song, T. Oh, J. Lee, J. Oh, S. Lyu, Y. Jeong, I. Lee, S. Seo, D. Lee, H. Kim, M. Lee, S. Jang, S. Do, S. Kim, K. Lim, J. Lee, K. Park, J. Shin, S. Kim, L. Park, A. Oh, J.-W. Ha, and K. Cho, “KLUE: Korean language understanding evaluation,” in </w:t>
-      </w:r>
-      <w:r>
-        <w:rPr>
-          <w:rFonts w:ascii="Times New Roman" w:hAnsi="Times New Roman" w:eastAsia="Malgun Gothic"/>
-          <w:b w:val="0"/>
-          <w:i/>
-          <w:color w:val="000000"/>
-          <w:sz w:val="16"/>
-        </w:rPr>
-        <w:t>Proc. 35th Conf. Neural Information Processing Systems (NeurIPS) Datasets and Benchmarks Track</w:t>
-      </w:r>
-      <w:r>
-        <w:rPr>
-          <w:rFonts w:ascii="Times New Roman" w:hAnsi="Times New Roman" w:eastAsia="Malgun Gothic"/>
-          <w:b w:val="0"/>
-          <w:i w:val="0"/>
-          <w:color w:val="000000"/>
-          <w:sz w:val="16"/>
-        </w:rPr>
-        <w:t>, 2021.</w:t>
+        <w:t>Duolingo, Inc., “An overview of Duolingo English Test administration and scoring,” Duolingo, Pittsburgh, PA, USA, Tech. Rep., 2024. [Online]. Available: https://duolingo-papers.s3.amazonaws.com/reports/Duolingo_whitepaper_test_scoring_2024_v1.pdf.</w:t>
       </w:r>
     </w:p>
     <w:p>
@@ -4608,7 +4568,27 @@
           <w:color w:val="000000"/>
           <w:sz w:val="16"/>
         </w:rPr>
-        <w:t>Duolingo, Inc., “How Duolingo’s AI learns what you need to learn,” Duolingo Engineering Blog, 2023. [Online]. Available: https://blog.duolingo.com/duolingo-technology-innovations/. [Accessed: 18-Oct-2026].</w:t>
+        <w:t xml:space="preserve">E. Cosyn, H. Uzun, C. Doble, and J. Matayoshi, “A practical perspective on knowledge space theory: ALEKS and its data,” </w:t>
+      </w:r>
+      <w:r>
+        <w:rPr>
+          <w:rFonts w:ascii="Times New Roman" w:hAnsi="Times New Roman" w:eastAsia="Malgun Gothic"/>
+          <w:b w:val="0"/>
+          <w:i/>
+          <w:color w:val="000000"/>
+          <w:sz w:val="16"/>
+        </w:rPr>
+        <w:t>Journal of Mathematical Psychology</w:t>
+      </w:r>
+      <w:r>
+        <w:rPr>
+          <w:rFonts w:ascii="Times New Roman" w:hAnsi="Times New Roman" w:eastAsia="Malgun Gothic"/>
+          <w:b w:val="0"/>
+          <w:i w:val="0"/>
+          <w:color w:val="000000"/>
+          <w:sz w:val="16"/>
+        </w:rPr>
+        <w:t>, vol. 101, p. 102512, Apr. 2021, doi: 10.1016/j.jmp.2021.102512.</w:t>
       </w:r>
     </w:p>
     <w:p>
@@ -4637,7 +4617,27 @@
           <w:color w:val="000000"/>
           <w:sz w:val="16"/>
         </w:rPr>
-        <w:t>Duolingo, Inc., “An overview of Duolingo English Test administration and scoring,” Duolingo, Pittsburgh, PA, USA, Tech. Rep., 2024. [Online]. Available: https://duolingo-papers.s3.amazonaws.com/reports/Duolingo_whitepaper_test_scoring_2024_v1.pdf.</w:t>
+        <w:t xml:space="preserve">S. Klinkenberg, M. Straatemeier, and H. L. J. van der Maas, “Computer adaptive practice of maths ability using a new item response model for on the fly ability and difficulty estimation,” </w:t>
+      </w:r>
+      <w:r>
+        <w:rPr>
+          <w:rFonts w:ascii="Times New Roman" w:hAnsi="Times New Roman" w:eastAsia="Malgun Gothic"/>
+          <w:b w:val="0"/>
+          <w:i/>
+          <w:color w:val="000000"/>
+          <w:sz w:val="16"/>
+        </w:rPr>
+        <w:t>Computers &amp; Education</w:t>
+      </w:r>
+      <w:r>
+        <w:rPr>
+          <w:rFonts w:ascii="Times New Roman" w:hAnsi="Times New Roman" w:eastAsia="Malgun Gothic"/>
+          <w:b w:val="0"/>
+          <w:i w:val="0"/>
+          <w:color w:val="000000"/>
+          <w:sz w:val="16"/>
+        </w:rPr>
+        <w:t>, vol. 57, no. 2, pp. 1813–1824, Sep. 2011, doi: 10.1016/j.compedu.2011.02.003.</w:t>
       </w:r>
     </w:p>
     <w:p>
@@ -4666,27 +4666,7 @@
           <w:color w:val="000000"/>
           <w:sz w:val="16"/>
         </w:rPr>
-        <w:t xml:space="preserve">E. Cosyn, H. Uzun, C. Doble, and J. Matayoshi, “A practical perspective on knowledge space theory: ALEKS and its data,” </w:t>
-      </w:r>
-      <w:r>
-        <w:rPr>
-          <w:rFonts w:ascii="Times New Roman" w:hAnsi="Times New Roman" w:eastAsia="Malgun Gothic"/>
-          <w:b w:val="0"/>
-          <w:i/>
-          <w:color w:val="000000"/>
-          <w:sz w:val="16"/>
-        </w:rPr>
-        <w:t>Journal of Mathematical Psychology</w:t>
-      </w:r>
-      <w:r>
-        <w:rPr>
-          <w:rFonts w:ascii="Times New Roman" w:hAnsi="Times New Roman" w:eastAsia="Malgun Gothic"/>
-          <w:b w:val="0"/>
-          <w:i w:val="0"/>
-          <w:color w:val="000000"/>
-          <w:sz w:val="16"/>
-        </w:rPr>
-        <w:t>, vol. 101, p. 102512, Apr. 2021, doi: 10.1016/j.jmp.2021.102512.</w:t>
+        <w:t>J. Ye and the Open Spaced Repetition community, “Free Spaced Repetition Scheduler (FSRS),” 2022. [Online]. Available: https://github.com/open-spaced-repetition. [Accessed: 18-Oct-2026].</w:t>
       </w:r>
     </w:p>
     <w:p>
@@ -4715,7 +4695,7 @@
           <w:color w:val="000000"/>
           <w:sz w:val="16"/>
         </w:rPr>
-        <w:t xml:space="preserve">S. Klinkenberg, M. Straatemeier, and H. L. J. van der Maas, “Computer adaptive practice of maths ability using a new item response model for on the fly ability and difficulty estimation,” </w:t>
+        <w:t xml:space="preserve">C. Guo, G. Pleiss, Y. Sun, and K. Q. Weinberger, “On calibration of modern neural networks,” in </w:t>
       </w:r>
       <w:r>
         <w:rPr>
@@ -4725,7 +4705,7 @@
           <w:color w:val="000000"/>
           <w:sz w:val="16"/>
         </w:rPr>
-        <w:t>Computers &amp; Education</w:t>
+        <w:t>Proc. 34th Int. Conf. Mach. Learn. (ICML)</w:t>
       </w:r>
       <w:r>
         <w:rPr>
@@ -4735,7 +4715,7 @@
           <w:color w:val="000000"/>
           <w:sz w:val="16"/>
         </w:rPr>
-        <w:t>, vol. 57, no. 2, pp. 1813–1824, Sep. 2011, doi: 10.1016/j.compedu.2011.02.003.</w:t>
+        <w:t>, Sydney, Australia, 2017, pp. 1321–1330.</w:t>
       </w:r>
     </w:p>
     <w:p>
@@ -4764,7 +4744,27 @@
           <w:color w:val="000000"/>
           <w:sz w:val="16"/>
         </w:rPr>
-        <w:t>J. Ye and the Open Spaced Repetition community, “Free Spaced Repetition Scheduler (FSRS),” 2022. [Online]. Available: https://github.com/open-spaced-repetition. [Accessed: 18-Oct-2026].</w:t>
+        <w:t xml:space="preserve">V. Kuleshov, N. Fenner, and S. Ermon, “Accurate uncertainties for deep learning using calibrated regression,” in </w:t>
+      </w:r>
+      <w:r>
+        <w:rPr>
+          <w:rFonts w:ascii="Times New Roman" w:hAnsi="Times New Roman" w:eastAsia="Malgun Gothic"/>
+          <w:b w:val="0"/>
+          <w:i/>
+          <w:color w:val="000000"/>
+          <w:sz w:val="16"/>
+        </w:rPr>
+        <w:t>Proc. 35th Int. Conf. Mach. Learn. (ICML)</w:t>
+      </w:r>
+      <w:r>
+        <w:rPr>
+          <w:rFonts w:ascii="Times New Roman" w:hAnsi="Times New Roman" w:eastAsia="Malgun Gothic"/>
+          <w:b w:val="0"/>
+          <w:i w:val="0"/>
+          <w:color w:val="000000"/>
+          <w:sz w:val="16"/>
+        </w:rPr>
+        <w:t>, Stockholm, Sweden, 2018, pp. 2801–2809.</w:t>
       </w:r>
     </w:p>
     <w:p>
@@ -4783,104 +4783,6 @@
           <w:sz w:val="16"/>
         </w:rPr>
         <w:t>[42]</w:t>
-        <w:tab/>
-      </w:r>
-      <w:r>
-        <w:rPr>
-          <w:rFonts w:ascii="Times New Roman" w:hAnsi="Times New Roman" w:eastAsia="Malgun Gothic"/>
-          <w:b w:val="0"/>
-          <w:i w:val="0"/>
-          <w:color w:val="000000"/>
-          <w:sz w:val="16"/>
-        </w:rPr>
-        <w:t xml:space="preserve">C. Guo, G. Pleiss, Y. Sun, and K. Q. Weinberger, “On calibration of modern neural networks,” in </w:t>
-      </w:r>
-      <w:r>
-        <w:rPr>
-          <w:rFonts w:ascii="Times New Roman" w:hAnsi="Times New Roman" w:eastAsia="Malgun Gothic"/>
-          <w:b w:val="0"/>
-          <w:i/>
-          <w:color w:val="000000"/>
-          <w:sz w:val="16"/>
-        </w:rPr>
-        <w:t>Proc. 34th Int. Conf. Mach. Learn. (ICML)</w:t>
-      </w:r>
-      <w:r>
-        <w:rPr>
-          <w:rFonts w:ascii="Times New Roman" w:hAnsi="Times New Roman" w:eastAsia="Malgun Gothic"/>
-          <w:b w:val="0"/>
-          <w:i w:val="0"/>
-          <w:color w:val="000000"/>
-          <w:sz w:val="16"/>
-        </w:rPr>
-        <w:t>, Sydney, Australia, 2017, pp. 1321–1330.</w:t>
-      </w:r>
-    </w:p>
-    <w:p>
-      <w:pPr>
-        <w:widowControl/>
-        <w:spacing w:after="40" w:before="0" w:line="240" w:lineRule="auto"/>
-        <w:ind w:left="317" w:hanging="317"/>
-        <w:jc w:val="both"/>
-      </w:pPr>
-      <w:r>
-        <w:rPr>
-          <w:rFonts w:ascii="Times New Roman" w:hAnsi="Times New Roman" w:eastAsia="Malgun Gothic"/>
-          <w:b w:val="0"/>
-          <w:i w:val="0"/>
-          <w:color w:val="000000"/>
-          <w:sz w:val="16"/>
-        </w:rPr>
-        <w:t>[43]</w:t>
-        <w:tab/>
-      </w:r>
-      <w:r>
-        <w:rPr>
-          <w:rFonts w:ascii="Times New Roman" w:hAnsi="Times New Roman" w:eastAsia="Malgun Gothic"/>
-          <w:b w:val="0"/>
-          <w:i w:val="0"/>
-          <w:color w:val="000000"/>
-          <w:sz w:val="16"/>
-        </w:rPr>
-        <w:t xml:space="preserve">V. Kuleshov, N. Fenner, and S. Ermon, “Accurate uncertainties for deep learning using calibrated regression,” in </w:t>
-      </w:r>
-      <w:r>
-        <w:rPr>
-          <w:rFonts w:ascii="Times New Roman" w:hAnsi="Times New Roman" w:eastAsia="Malgun Gothic"/>
-          <w:b w:val="0"/>
-          <w:i/>
-          <w:color w:val="000000"/>
-          <w:sz w:val="16"/>
-        </w:rPr>
-        <w:t>Proc. 35th Int. Conf. Mach. Learn. (ICML)</w:t>
-      </w:r>
-      <w:r>
-        <w:rPr>
-          <w:rFonts w:ascii="Times New Roman" w:hAnsi="Times New Roman" w:eastAsia="Malgun Gothic"/>
-          <w:b w:val="0"/>
-          <w:i w:val="0"/>
-          <w:color w:val="000000"/>
-          <w:sz w:val="16"/>
-        </w:rPr>
-        <w:t>, Stockholm, Sweden, 2018, pp. 2801–2809.</w:t>
-      </w:r>
-    </w:p>
-    <w:p>
-      <w:pPr>
-        <w:widowControl/>
-        <w:spacing w:after="40" w:before="0" w:line="240" w:lineRule="auto"/>
-        <w:ind w:left="317" w:hanging="317"/>
-        <w:jc w:val="both"/>
-      </w:pPr>
-      <w:r>
-        <w:rPr>
-          <w:rFonts w:ascii="Times New Roman" w:hAnsi="Times New Roman" w:eastAsia="Malgun Gothic"/>
-          <w:b w:val="0"/>
-          <w:i w:val="0"/>
-          <w:color w:val="000000"/>
-          <w:sz w:val="16"/>
-        </w:rPr>
-        <w:t>[44]</w:t>
         <w:tab/>
       </w:r>
       <w:r>

</xml_diff>

<commit_message>
Remove the misconception codebook: label each distractor by its KAGAS edit
The annotator already yields a stable code for every distractor
(PART:에서>에), so items no longer need a generated, reviewed list of
misconceptions. Targeted requests describe the code in words; validation
reports distinct and recurring codes per skill (PRD 9.74).

Co-Authored-By: Claude Opus 5.5 (1M context) <noreply@anthropic.com>
Claude-Session: https://claude.ai/code/session_01JqhSkdnXWeiH29pWuWynyf
</commit_message>
<xml_diff>
--- a/paper/KO-DRILL_IEEE.docx
+++ b/paper/KO-DRILL_IEEE.docx
@@ -128,7 +128,7 @@
           <w:color w:val="000000"/>
           <w:sz w:val="18"/>
         </w:rPr>
-        <w:t>Drill practice—short, repeated question-and-answer exercises—is among the most reliable ways to consolidate the grammar and vocabulary of a second language, but it only works when each question is pitched at the right level for the individual learner. Large language models (LLMs) can now write such questions on demand, which removes the long-standing bottleneck of authoring exercises by hand. It also creates a new and largely unexamined problem. When questions are produced continuously, every question is new, so the system has no record of how difficult it actually is. Classical adaptive testing assumes a fixed, pre-tested question bank; deep knowledge tracing assumes dense histories in which many learners answer the same questions. In a generative setting neither assumption holds. This paper presents KO-DRILL, a pipeline for personalised Korean drill quizzes built around that difficulty. We make three design arguments and support them with evidence. First, deep learning should be used selectively: an LLM for writing Korean, a small fine-tuned encoder for predicting difficulty from text, and an explicit psychometric model—not a neural network—for tracking what a learner knows. Second, the Elo rating system, the default choice in adaptive practice platforms, is specifically unsuited here; in a simulation of 120,000 responses we reproduce its documented failure, with the spread of learner ratings inflating to 2.3 against a true value of 1.0 and still rising, while the Urnings algorithm, with its acceptance step corrected for adaptive item selection, remains calibrated at 1.0. Third, we propose misconception-conditioned distractors. An LLM writes each item so that every wrong option realises one named misconception, checked without asking a model to judge: a KAGAS-style annotator confirms each distractor is a minimal edit of the key in the tested category, and log-probability scoring under a second model confirms the key is the only correct answer. A multinomial choice model, updated online, then reads which misconception a learner holds from the option they pick. In simulation it names the dominant misconception for 58% of learners after ten wrong answers (chance 17%), and after a misconception is remediated finds the new one for 53%, against 40% for a full-history fit. The next item is then personalised in which error it confronts, not only in how hard it is. We validate the novelty with targeted comparisons rather than a broad ablation grid, and set out an exploratory classroom pilot as secondary evidence.</w:t>
+        <w:t>Drill practice—short, repeated question-and-answer exercises—is among the most reliable ways to consolidate the grammar and vocabulary of a second language, but it only works when each question is pitched at the right level for the individual learner. Large language models (LLMs) can now write such questions on demand, which removes the long-standing bottleneck of authoring exercises by hand. It also creates a new and largely unexamined problem. When questions are produced continuously, every question is new, so the system has no record of how difficult it actually is. Classical adaptive testing assumes a fixed, pre-tested question bank; deep knowledge tracing assumes dense histories in which many learners answer the same questions. In a generative setting neither assumption holds. This paper presents KO-DRILL, a pipeline for personalised Korean drill quizzes built around that difficulty. We make three design arguments and support them with evidence. First, deep learning should be used selectively: an LLM for writing Korean, a small fine-tuned encoder for predicting difficulty from text, and an explicit psychometric model—not a neural network—for tracking what a learner knows. Second, the Elo rating system, the default choice in adaptive practice platforms, is specifically unsuited here; in a simulation of 120,000 responses we reproduce its documented failure, with the spread of learner ratings inflating to 2.3 against a true value of 1.0 and still rising, while the Urnings algorithm, with its acceptance step corrected for adaptive item selection, remains calibrated at 1.0. Third, we propose misconception-conditioned distractors. An LLM writes each item so that every wrong option realises one named misconception, checked without asking a model to judge: a KAGAS-style annotator confirms each distractor is a minimal edit of the key in the tested category and labels it by that edit, and log-probability scoring under a second model confirms the key is the only correct answer. A multinomial choice model, updated online, then reads which misconception a learner holds from the option they pick. In simulation it names the dominant misconception for 58% of learners after ten wrong answers (chance 17%), and after a misconception is remediated finds the new one for 53%, against 40% for a full-history fit. The next item is then personalised in which error it confronts, not only in how hard it is. We validate the novelty with targeted comparisons rather than a broad ablation grid, and set out an exploratory classroom pilot as secondary evidence.</w:t>
       </w:r>
     </w:p>
     <w:p>
@@ -1722,7 +1722,7 @@
           <w:color w:val="000000"/>
           <w:sz w:val="20"/>
         </w:rPr>
-        <w:t>Naming the misconceptions. Each skill has a codebook of the misconceptions learners hold about it, grounded in the error categories of KAGAS, the Korean automatic grammatical error annotation scheme [43]. The codebook is written by the generator, not by us: EXAONE lists the common mistaken rules for the grammar point, each with a correct sentence and the sentence a learner holding that rule would write. An entry is kept only if a KAGAS-style annotator, which aligns the two sentences' morphemes (kiwipiepy) and classifies each change by its grammatical category, finds the example to be exactly one edit, in the category the skill tests. For closed-class edits (particles, endings, counters) the edit itself names the misconception, for example PART:에서→에, after merging phonologically conditioned allomorphs such as 을/를, so the same misconception receives the same code in every item. For open-class edits, such as one verb for another, the code is the codebook entry. The codebook is generated once per skill and then frozen, so the labels are data an instructor can audit, not a by-product hidden inside prompts.</w:t>
+        <w:t>Naming the misconceptions. A distractor's misconception label is computed, not written: a KAGAS-style annotator, following the Korean automatic grammatical error annotation scheme [43], aligns the morphemes of the key sentence and the distractor sentence (kiwipiepy) and classifies the change by its grammatical category, and the label is that edit. For closed-class edits (particles, endings, counters) the edit names the misconception directly, for example PART:에서→에 or END:었→았, after merging phonologically conditioned allomorphs such as 을/를, so the same error receives the same code in every item without any list of misconceptions written beforehand, by us or by a model. For open-class edits, such as one verb for another, the code is the lexical pair (VERB:마시→먹), which recurs less often across items. The labels are therefore deterministic and auditable from the item alone.</w:t>
       </w:r>
     </w:p>
     <w:p>
@@ -1740,7 +1740,7 @@
           <w:color w:val="000000"/>
           <w:sz w:val="20"/>
         </w:rPr>
-        <w:t>Generating items. For each item, EXAONE writes a new sentence using the grammar point, marks the span that tests it, and writes three wrong versions of that span, each realising a different codebook misconception. When the learner model already knows which misconception a learner currently holds for the skill, the request requires one distractor to realise it: the next item then confronts that error again, and its outcome measures whether the error is still held. The item is personalised in which error it tests, not only in how hard it is. No sentence, slot or distractor comes from a hand-written list.</w:t>
+        <w:t>Generating items. For each item, EXAONE writes a new sentence using the grammar point, marks the span that tests it, and writes three wrong versions of that span, each a different mistake learners typically make. When the learner model already knows which misconception a learner currently holds for the skill, the request requires one distractor to make that mistake, stated to the generator in words from its code: the next item then confronts that error again, and its outcome measures whether the error is still held. The item is personalised in which error it tests, not only in how hard it is. No sentence, slot or distractor comes from a hand-written list.</w:t>
       </w:r>
     </w:p>
     <w:p>
@@ -1758,7 +1758,7 @@
           <w:color w:val="000000"/>
           <w:sz w:val="20"/>
         </w:rPr>
-        <w:t>Verifying items. An LLM-written distractor is only useful if it is wrong for the stated reason and wrong at all. Every check below is made without asking a model to judge, because asking Qwen3-4B whether a distractor is also acceptable failed in all three framings we tried (a persistent yes-bias, inconsistency in both directions, and below-chance pairwise comparison). First, the annotator confirms each distractor is a minimal pair of the key: exactly one edit, in the skill's category. Second, its code: the annotator's edit for a closed-class change, which must agree with the codebook entry the generator named; the named entry otherwise. Third, the three codes differ, so whichever distractor is chosen is informative. Fourth, the key must be the only correct answer, checked by scoring rather than judging: under Qwen3-4B, a different model family from the generator, the sentence with the key must have a higher teacher-forced log-probability than the sentence with each distractor, as in minimal-pair evaluation of language models. On the curated minimal pairs of the earlier template system this ordering held for 51 of 52 unique pairs. It is not applied to subj_topic, whose correct answer follows a discourse convention that a language model's distribution does not reflect. An item failing any check is not discarded: the reasons are returned to EXAONE, which revises the item, up to twice, before it is dropped.</w:t>
+        <w:t>Verifying items. An LLM-written distractor is only useful if it is wrong for the stated reason and wrong at all. Every check below is made without asking a model to judge, because asking Qwen3-4B whether a distractor is also acceptable failed in all three framings we tried (a persistent yes-bias, inconsistency in both directions, and below-chance pairwise comparison). First, the annotator confirms each distractor is a minimal pair of the key: exactly one edit, in the skill's category; that edit is its code. Second, the three codes differ, so whichever distractor is chosen is informative. Third, the key must be the only correct answer, checked by scoring rather than judging: under Qwen3-4B, a different model family from the generator, the sentence with the key must have a higher teacher-forced log-probability than the sentence with each distractor, as in minimal-pair evaluation of language models. On the curated minimal pairs of the earlier template system this ordering held for 51 of 52 unique pairs. It is not applied to subj_topic, whose correct answer follows a discourse convention that a language model's distribution does not reflect. An item failing any check is not discarded: the reasons are returned to EXAONE, which revises the item, up to twice, before it is dropped.</w:t>
       </w:r>
     </w:p>
     <w:p>
@@ -2623,7 +2623,7 @@
           <w:color w:val="000000"/>
           <w:sz w:val="20"/>
         </w:rPr>
-        <w:t>The target curriculum this architecture is designed for is a TOPIK-aligned syllabus spanning levels I through IV, roughly 120 discrete grammatical points; what is actually built and evaluated here is 11 skills, covering 7 of the 7 relevant KAGAS part-of-speech categories. The gap between 120 and 11 is simply unimplemented coverage, not a claim about what has been tested—every number in Section V-B below is reported at the 11-skill scale, never projected onto the full syllabus. Misconception codes are grounded in the KAGAS error categories [43] rather than a project-specific scheme, and each skill's codebook is frozen and published with the items, so that the diagnostic labels a generated distractor carries are independently auditable. All generated items entering any evaluation are reviewed by qualified Korean instructors first; we report, but do not act on, the verifier's agreement with those reviewers, so that the verifier's standalone accuracy can be measured on its own terms.</w:t>
+        <w:t>The target curriculum this architecture is designed for is a TOPIK-aligned syllabus spanning levels I through IV, roughly 120 discrete grammatical points; what is actually built and evaluated here is 11 skills, covering 7 of the 7 relevant KAGAS part-of-speech categories. The gap between 120 and 11 is simply unimplemented coverage, not a claim about what has been tested—every number in Section V-B below is reported at the 11-skill scale, never projected onto the full syllabus. Misconception codes are grounded in the KAGAS error categories [43] rather than a project-specific scheme, and each code is the annotator's edit between the key and the distractor, so that the diagnostic labels a generated distractor carries are independently auditable. All generated items entering any evaluation are reviewed by qualified Korean instructors first; we report, but do not act on, the verifier's agreement with those reviewers, so that the verifier's standalone accuracy can be measured on its own terms.</w:t>
       </w:r>
     </w:p>
     <w:p>
@@ -2798,7 +2798,7 @@
           <w:color w:val="000000"/>
           <w:sz w:val="20"/>
         </w:rPr>
-        <w:t>Does the item foundry produce verified items, and how often? validate_item_foundry requests 20 items per skill across the 11 skills, half of them targeted at a codebook misconception drawn at random, and reports with Wilson intervals the share accepted after at most two revisions, the reasons replies were rejected, how many of each skill's codebook misconceptions the accepted items cover, and, as a second view that is reported but not used as a gate, whether Qwen3-4B picks the key by letter under every rotation of the options. These runs need a GPU and have not yet been made with the item foundry; this paragraph is the protocol, and every accepted item is saved for the instructor review below.</w:t>
+        <w:t>Does the item foundry produce verified items, and how often? validate_item_foundry requests 20 items per skill across the 11 skills, half of them targeted at a misconception already seen in that skill's accepted items, and reports with Wilson intervals the share accepted after at most two revisions, the reasons replies were rejected, how many distinct codes the accepted items use and how many recur, and, as a second view that is reported but not used as a gate, whether Qwen3-4B picks the key by letter under every rotation of the options. These runs need a GPU and have not yet been made with the item foundry; this paragraph is the protocol, and every accepted item is saved for the instructor review below.</w:t>
       </w:r>
     </w:p>
     <w:p>
@@ -2816,7 +2816,7 @@
           <w:color w:val="000000"/>
           <w:sz w:val="20"/>
         </w:rPr>
-        <w:t>Item quality is rated by three independent Korean language instructors on four dimensions — grammaticality of the stem, uniqueness of the key, plausibility of each distractor, and correctness of its misconception label — with agreement reported as Fleiss' κ. Two measures matter most. First, the rate of items containing more than one defensible answer, since this is the failure the verifier gate in Section IV-B exists specifically to catch, and it is the one the general distractor-generation literature does not report [6]. Second, agreement between the codebook misconception a distractor was generated and verified to realise and the one an instructor independently assigns after seeing only the sentence, the distractor and the codebook — this is the direct test of whether misconception-conditioning actually produces a usable diagnosis, or merely a plausible wrong answer with a label attached. Neither measure is available yet; this subsection is the protocol, not a result.</w:t>
+        <w:t>Item quality is rated by three independent Korean language instructors on four dimensions — grammaticality of the stem, uniqueness of the key, plausibility of each distractor, and correctness of its misconception label — with agreement reported as Fleiss' κ. Two measures matter most. First, the rate of items containing more than one defensible answer, since this is the failure the verifier gate in Section IV-B exists specifically to catch, and it is the one the general distractor-generation literature does not report [6]. Second, whether the error a distractor's code names is one an instructor recognises as a real learner misconception, and whether two instructors given only the sentence and the distractor describe the same error — this is the direct test of whether misconception-conditioning actually produces a usable diagnosis, or merely a plausible wrong answer with a label attached. Neither measure is available yet; this subsection is the protocol, not a result.</w:t>
       </w:r>
     </w:p>
     <w:p>

</xml_diff>